<commit_message>
Report: make memory structures its own section and expand on placeholders
Co-Authored-By: Claude Opus 5.5 <noreply@anthropic.com>
Claude-Session: https://claude.ai/code/session_01Pj1PPavthJ9iFe8XHJiggU
</commit_message>
<xml_diff>
--- a/pnl_issues.docx
+++ b/pnl_issues.docx
@@ -15,12 +15,12 @@
         <w:pStyle w:val="Heading1"/>
       </w:pPr>
       <w:r>
-        <w:t>Missing functionality</w:t>
+        <w:t>Memory structures</w:t>
       </w:r>
     </w:p>
     <w:p>
       <w:r>
-        <w:t>Ordered by significance relative to implementation difficulty.</w:t>
+        <w:t>This is the main reason ESBN couldn't be built in PsyNeuLink. ESBN needs two memories that start empty for each sequence, grow by one entry per step, and expose the raw query-key dot products; none of PsyNeuLink's memory structures does all of this.</w:t>
       </w:r>
     </w:p>
     <w:p>
@@ -28,7 +28,7 @@
         <w:pStyle w:val="Heading2"/>
       </w:pPr>
       <w:r>
-        <w:t>Edges require fixed sizes</w:t>
+        <w:t>Key-value memory is limited</w:t>
       </w:r>
     </w:p>
     <w:p>
@@ -36,8 +36,147 @@
         <w:pStyle w:val="ListBullet"/>
       </w:pPr>
       <w:r>
-        <w:t xml:space="preserve">A node's value can change size between trials (a </w:t>
-      </w:r>
+        <w:t xml:space="preserve">Storing a key and its value as a pair: </w:t>
+      </w:r>
+      <w:r>
+        <w:rPr>
+          <w:rFonts w:ascii="Consolas" w:hAnsi="Consolas"/>
+          <w:color w:val="802020"/>
+        </w:rPr>
+        <w:t>ContentAddressableMemory</w:t>
+      </w:r>
+      <w:r>
+        <w:t xml:space="preserve"> supports multiple fields, but its weighted (softmax) retrieval only works with </w:t>
+      </w:r>
+      <w:r>
+        <w:rPr>
+          <w:rFonts w:ascii="Consolas" w:hAnsi="Consolas"/>
+          <w:color w:val="802020"/>
+        </w:rPr>
+        <w:t>duplicate_entries_allowed=False</w:t>
+      </w:r>
+      <w:r>
+        <w:t xml:space="preserve"> (</w:t>
+      </w:r>
+      <w:r>
+        <w:rPr>
+          <w:rFonts w:ascii="Consolas" w:hAnsi="Consolas"/>
+          <w:color w:val="802020"/>
+        </w:rPr>
+        <w:t>memoryfunctions.py:1405-1417</w:t>
+      </w:r>
+      <w:r>
+        <w:t xml:space="preserve">). In that mode a repeated entry isn't stored: 3 inputs, one of them repeated, stored only 2 entries. </w:t>
+      </w:r>
+      <w:r>
+        <w:rPr>
+          <w:rFonts w:ascii="Consolas" w:hAnsi="Consolas"/>
+          <w:color w:val="802020"/>
+        </w:rPr>
+        <w:t>EMComposition</w:t>
+      </w:r>
+      <w:r>
+        <w:t xml:space="preserve"> stores key and value fields together, but it has a fixed capacity and doesn't allow adding nodes. In practice, it was simpler to keep keys and values in separate memories, aligned by slot.</w:t>
+      </w:r>
+    </w:p>
+    <w:p>
+      <w:pPr>
+        <w:pStyle w:val="ListBullet"/>
+      </w:pPr>
+      <w:r>
+        <w:t xml:space="preserve">Raw query-key dot products can't be read out of </w:t>
+      </w:r>
+      <w:r>
+        <w:rPr>
+          <w:rFonts w:ascii="Consolas" w:hAnsi="Consolas"/>
+          <w:color w:val="802020"/>
+        </w:rPr>
+        <w:t>EMComposition</w:t>
+      </w:r>
+      <w:r>
+        <w:t>. The key field's memory node runs twice per trial: the first run computes the raw scores (</w:t>
+      </w:r>
+      <w:r>
+        <w:rPr>
+          <w:rFonts w:ascii="Consolas" w:hAnsi="Consolas"/>
+          <w:color w:val="802020"/>
+        </w:rPr>
+        <w:t>[4, 3]</w:t>
+      </w:r>
+      <w:r>
+        <w:t xml:space="preserve">), and the second overwrites the same </w:t>
+      </w:r>
+      <w:r>
+        <w:rPr>
+          <w:rFonts w:ascii="Consolas" w:hAnsi="Consolas"/>
+          <w:color w:val="802020"/>
+        </w:rPr>
+        <w:t>SCORES</w:t>
+      </w:r>
+      <w:r>
+        <w:t xml:space="preserve"> output with softmaxed weights (</w:t>
+      </w:r>
+      <w:r>
+        <w:rPr>
+          <w:rFonts w:ascii="Consolas" w:hAnsi="Consolas"/>
+          <w:color w:val="802020"/>
+        </w:rPr>
+        <w:t>[0.7311, 0.2689]</w:t>
+      </w:r>
+      <w:r>
+        <w:t xml:space="preserve">). A node outside the EMComposition connected to </w:t>
+      </w:r>
+      <w:r>
+        <w:rPr>
+          <w:rFonts w:ascii="Consolas" w:hAnsi="Consolas"/>
+          <w:color w:val="802020"/>
+        </w:rPr>
+        <w:t>SCORES</w:t>
+      </w:r>
+      <w:r>
+        <w:t xml:space="preserve"> receives only the softmaxed values. Adding a node inside raises </w:t>
+      </w:r>
+      <w:r>
+        <w:rPr>
+          <w:rFonts w:ascii="Consolas" w:hAnsi="Consolas"/>
+          <w:color w:val="802020"/>
+        </w:rPr>
+        <w:t>Nodes cannot be added to an EMComposition</w:t>
+      </w:r>
+      <w:r>
+        <w:t xml:space="preserve">. Softmax can't be inverted, because it keeps only the differences between scores. Logging captures the raw scores, but only for inspection after the trial. Anything that needs per-key raw scores (e.g. ESBN's confidence gate, </w:t>
+      </w:r>
+      <w:r>
+        <w:rPr>
+          <w:rFonts w:ascii="Consolas" w:hAnsi="Consolas"/>
+          <w:color w:val="802020"/>
+        </w:rPr>
+        <w:t>σ(γ·s + β)</w:t>
+      </w:r>
+      <w:r>
+        <w:t>) can't be built on it.</w:t>
+      </w:r>
+    </w:p>
+    <w:p>
+      <w:pPr>
+        <w:pStyle w:val="ListBullet"/>
+      </w:pPr>
+      <w:r>
+        <w:t>Proposal: a separate raw-scores output that's only updated on the score-computing run, supported in EMComposition's PyTorch version as well.</w:t>
+      </w:r>
+    </w:p>
+    <w:p>
+      <w:pPr>
+        <w:pStyle w:val="ListBullet"/>
+      </w:pPr>
+      <w:r>
+        <w:t>Empty memories and placeholders:</w:t>
+      </w:r>
+    </w:p>
+    <w:p>
+      <w:pPr>
+        <w:pStyle w:val="ListBullet2"/>
+      </w:pPr>
       <w:r>
         <w:rPr>
           <w:rFonts w:ascii="Consolas" w:hAnsi="Consolas"/>
@@ -46,6 +185,325 @@
         <w:t>Buffer</w:t>
       </w:r>
       <w:r>
+        <w:t xml:space="preserve"> can't start empty when its entries are vectors: an empty </w:t>
+      </w:r>
+      <w:r>
+        <w:rPr>
+          <w:rFonts w:ascii="Consolas" w:hAnsi="Consolas"/>
+          <w:color w:val="802020"/>
+        </w:rPr>
+        <w:t>initializer</w:t>
+      </w:r>
+      <w:r>
+        <w:t xml:space="preserve"> raises </w:t>
+      </w:r>
+      <w:r>
+        <w:rPr>
+          <w:rFonts w:ascii="Consolas" w:hAnsi="Consolas"/>
+          <w:color w:val="802020"/>
+        </w:rPr>
+        <w:t>initializer ([]) is incompatible with its default_variable</w:t>
+      </w:r>
+      <w:r>
+        <w:t>. It has to start with a placeholder entry of the right shape.</w:t>
+      </w:r>
+    </w:p>
+    <w:p>
+      <w:pPr>
+        <w:pStyle w:val="ListBullet2"/>
+      </w:pPr>
+      <w:r>
+        <w:t xml:space="preserve">Nothing removes the placeholder when the first real value arrives, so the memory holds </w:t>
+      </w:r>
+      <w:r>
+        <w:rPr>
+          <w:rFonts w:ascii="Consolas" w:hAnsi="Consolas"/>
+          <w:color w:val="802020"/>
+        </w:rPr>
+        <w:t>[placeholder, v_0, v_1, …]</w:t>
+      </w:r>
+      <w:r>
+        <w:t>. Every consumer has to skip index 0.</w:t>
+      </w:r>
+    </w:p>
+    <w:p>
+      <w:pPr>
+        <w:pStyle w:val="ListBullet2"/>
+      </w:pPr>
+      <w:r>
+        <w:rPr>
+          <w:rFonts w:ascii="Consolas" w:hAnsi="Consolas"/>
+          <w:color w:val="802020"/>
+        </w:rPr>
+        <w:t>Buffer</w:t>
+      </w:r>
+      <w:r>
+        <w:t>'s default output port passes on only its first stored item, which is the placeholder itself.</w:t>
+      </w:r>
+    </w:p>
+    <w:p>
+      <w:pPr>
+        <w:pStyle w:val="ListBullet2"/>
+      </w:pPr>
+      <w:r>
+        <w:rPr>
+          <w:rFonts w:ascii="Consolas" w:hAnsi="Consolas"/>
+          <w:color w:val="802020"/>
+        </w:rPr>
+        <w:t>reset()</w:t>
+      </w:r>
+      <w:r>
+        <w:t xml:space="preserve"> restores the placeholder, and only </w:t>
+      </w:r>
+      <w:r>
+        <w:rPr>
+          <w:rFonts w:ascii="Consolas" w:hAnsi="Consolas"/>
+          <w:color w:val="802020"/>
+        </w:rPr>
+        <w:t>reset([])</w:t>
+      </w:r>
+      <w:r>
+        <w:t xml:space="preserve"> empties the memory. So which layout the memory has depends on how it was last reset: with </w:t>
+      </w:r>
+      <w:r>
+        <w:rPr>
+          <w:rFonts w:ascii="Consolas" w:hAnsi="Consolas"/>
+          <w:color w:val="802020"/>
+        </w:rPr>
+        <w:t>reset([])</w:t>
+      </w:r>
+      <w:r>
+        <w:t xml:space="preserve"> between sequences, the first sequence has the placeholder and later ones don't.</w:t>
+      </w:r>
+    </w:p>
+    <w:p>
+      <w:pPr>
+        <w:pStyle w:val="ListBullet2"/>
+      </w:pPr>
+      <w:r>
+        <w:rPr>
+          <w:rFonts w:ascii="Consolas" w:hAnsi="Consolas"/>
+          <w:color w:val="802020"/>
+        </w:rPr>
+        <w:t>ContentAddressableMemory</w:t>
+      </w:r>
+      <w:r>
+        <w:t xml:space="preserve"> built without an initializer can't be reset: </w:t>
+      </w:r>
+      <w:r>
+        <w:rPr>
+          <w:rFonts w:ascii="Consolas" w:hAnsi="Consolas"/>
+          <w:color w:val="802020"/>
+        </w:rPr>
+        <w:t>reset()</w:t>
+      </w:r>
+      <w:r>
+        <w:t xml:space="preserve"> crashes (</w:t>
+      </w:r>
+      <w:r>
+        <w:rPr>
+          <w:rFonts w:ascii="Consolas" w:hAnsi="Consolas"/>
+          <w:color w:val="802020"/>
+        </w:rPr>
+        <w:t>'numpy.ndarray' object has no attribute 'clear'</w:t>
+      </w:r>
+      <w:r>
+        <w:t xml:space="preserve">, </w:t>
+      </w:r>
+      <w:r>
+        <w:rPr>
+          <w:rFonts w:ascii="Consolas" w:hAnsi="Consolas"/>
+          <w:color w:val="802020"/>
+        </w:rPr>
+        <w:t>memoryfunctions.py:1446</w:t>
+      </w:r>
+      <w:r>
+        <w:t>).</w:t>
+      </w:r>
+    </w:p>
+    <w:p>
+      <w:pPr>
+        <w:pStyle w:val="ListBullet2"/>
+      </w:pPr>
+      <w:r>
+        <w:t xml:space="preserve">An empty </w:t>
+      </w:r>
+      <w:r>
+        <w:rPr>
+          <w:rFonts w:ascii="Consolas" w:hAnsi="Consolas"/>
+          <w:color w:val="802020"/>
+        </w:rPr>
+        <w:t>ContentAddressableMemory</w:t>
+      </w:r>
+      <w:r>
+        <w:t xml:space="preserve"> reports </w:t>
+      </w:r>
+      <w:r>
+        <w:rPr>
+          <w:rFonts w:ascii="Consolas" w:hAnsi="Consolas"/>
+          <w:color w:val="802020"/>
+        </w:rPr>
+        <w:t>[0]</w:t>
+      </w:r>
+      <w:r>
+        <w:t xml:space="preserve"> as its scores (</w:t>
+      </w:r>
+      <w:r>
+        <w:rPr>
+          <w:rFonts w:ascii="Consolas" w:hAnsi="Consolas"/>
+          <w:color w:val="802020"/>
+        </w:rPr>
+        <w:t>distances_to_entries</w:t>
+      </w:r>
+      <w:r>
+        <w:t xml:space="preserve"> defaults to </w:t>
+      </w:r>
+      <w:r>
+        <w:rPr>
+          <w:rFonts w:ascii="Consolas" w:hAnsi="Consolas"/>
+          <w:color w:val="802020"/>
+        </w:rPr>
+        <w:t>[0]</w:t>
+      </w:r>
+      <w:r>
+        <w:t xml:space="preserve">, </w:t>
+      </w:r>
+      <w:r>
+        <w:rPr>
+          <w:rFonts w:ascii="Consolas" w:hAnsi="Consolas"/>
+          <w:color w:val="802020"/>
+        </w:rPr>
+        <w:t>memoryfunctions.py:1211</w:t>
+      </w:r>
+      <w:r>
+        <w:t>), which is indistinguishable from one stored key scoring 0. An output port reading it is also built 1 wide.</w:t>
+      </w:r>
+    </w:p>
+    <w:p>
+      <w:pPr>
+        <w:pStyle w:val="ListBullet2"/>
+      </w:pPr>
+      <w:r>
+        <w:t xml:space="preserve">So in practice </w:t>
+      </w:r>
+      <w:r>
+        <w:rPr>
+          <w:rFonts w:ascii="Consolas" w:hAnsi="Consolas"/>
+          <w:color w:val="802020"/>
+        </w:rPr>
+        <w:t>ContentAddressableMemory</w:t>
+      </w:r>
+      <w:r>
+        <w:t xml:space="preserve"> also needs a placeholder key. With a zero key and a dot-product metric, its score is always 0, the same value as a padded empty slot or a real score of 0, so it can't be recognized from the output and has to be dropped by position (as </w:t>
+      </w:r>
+      <w:r>
+        <w:rPr>
+          <w:rFonts w:ascii="Consolas" w:hAnsi="Consolas"/>
+          <w:color w:val="802020"/>
+        </w:rPr>
+        <w:t>main.py</w:t>
+      </w:r>
+      <w:r>
+        <w:t xml:space="preserve"> does with </w:t>
+      </w:r>
+      <w:r>
+        <w:rPr>
+          <w:rFonts w:ascii="Consolas" w:hAnsi="Consolas"/>
+          <w:color w:val="802020"/>
+        </w:rPr>
+        <w:t>[1:]</w:t>
+      </w:r>
+      <w:r>
+        <w:t>).</w:t>
+      </w:r>
+    </w:p>
+    <w:p>
+      <w:pPr>
+        <w:pStyle w:val="ListBullet2"/>
+      </w:pPr>
+      <w:r>
+        <w:rPr>
+          <w:rFonts w:ascii="Consolas" w:hAnsi="Consolas"/>
+          <w:color w:val="802020"/>
+        </w:rPr>
+        <w:t>EMComposition</w:t>
+      </w:r>
+      <w:r>
+        <w:t xml:space="preserve"> has no placeholder, but its fixed-capacity memory is pre-filled with </w:t>
+      </w:r>
+      <w:r>
+        <w:rPr>
+          <w:rFonts w:ascii="Consolas" w:hAnsi="Consolas"/>
+          <w:color w:val="802020"/>
+        </w:rPr>
+        <w:t>memory_fill</w:t>
+      </w:r>
+      <w:r>
+        <w:t xml:space="preserve">. With a fill of 0, empty slots score 0, and the default </w:t>
+      </w:r>
+      <w:r>
+        <w:rPr>
+          <w:rFonts w:ascii="Consolas" w:hAnsi="Consolas"/>
+          <w:color w:val="802020"/>
+        </w:rPr>
+        <w:t>softmax_threshold=.001</w:t>
+      </w:r>
+      <w:r>
+        <w:t xml:space="preserve"> masks them, but it also masks real scores of 0: with one stored key scoring exactly 0, nothing was retrieved.</w:t>
+      </w:r>
+    </w:p>
+    <w:p>
+      <w:pPr>
+        <w:pStyle w:val="ListBullet2"/>
+      </w:pPr>
+      <w:r>
+        <w:t>As a result, every function downstream of a memory has to know that memory's placeholder convention: the offset of the first real entry, whether capacity checks count the placeholder, and which reset method was used.</w:t>
+      </w:r>
+    </w:p>
+    <w:p>
+      <w:pPr>
+        <w:pStyle w:val="ListBullet"/>
+      </w:pPr>
+      <w:r>
+        <w:t>Proposal: allow empty memories (an empty initializer with a declared entry shape), or a designated placeholder that's dropped on the first write. Also expose the number of stored entries, or a mask of filled slots, so padding and masking downstream don't depend on these conventions.</w:t>
+      </w:r>
+    </w:p>
+    <w:p>
+      <w:pPr>
+        <w:pStyle w:val="Heading1"/>
+      </w:pPr>
+      <w:r>
+        <w:t>Missing functionality</w:t>
+      </w:r>
+    </w:p>
+    <w:p>
+      <w:r>
+        <w:t>Ordered by significance relative to implementation difficulty.</w:t>
+      </w:r>
+    </w:p>
+    <w:p>
+      <w:pPr>
+        <w:pStyle w:val="Heading2"/>
+      </w:pPr>
+      <w:r>
+        <w:t>Edges require fixed sizes</w:t>
+      </w:r>
+    </w:p>
+    <w:p>
+      <w:pPr>
+        <w:pStyle w:val="ListBullet"/>
+      </w:pPr>
+      <w:r>
+        <w:t xml:space="preserve">A node's value can change size between trials (a </w:t>
+      </w:r>
+      <w:r>
+        <w:rPr>
+          <w:rFonts w:ascii="Consolas" w:hAnsi="Consolas"/>
+          <w:color w:val="802020"/>
+        </w:rPr>
+        <w:t>Buffer</w:t>
+      </w:r>
+      <w:r>
         <w:t xml:space="preserve">'s list grows by one entry per trial), but output ports and edges can't. Every projection's matrix is sized once, when it's created. So anything that grows with memory, such as query-key dot products (one per stored key), can't be sent along an edge directly. A growing output crashes on the next trial: </w:t>
       </w:r>
       <w:r>
@@ -252,148 +710,6 @@
       </w:pPr>
       <w:r>
         <w:t>Proposal: learnable scalar parameters, either as a projection whose single weight is broadcast, or as learnable function parameters. More generally, broadcasting along edges (a core PyTorch feature) would remove most of the fixed all-ones and identity "plumbing" projections.</w:t>
-      </w:r>
-    </w:p>
-    <w:p>
-      <w:pPr>
-        <w:pStyle w:val="Heading2"/>
-      </w:pPr>
-      <w:r>
-        <w:t>Key-value memory is limited</w:t>
-      </w:r>
-    </w:p>
-    <w:p>
-      <w:pPr>
-        <w:pStyle w:val="ListBullet"/>
-      </w:pPr>
-      <w:r>
-        <w:t xml:space="preserve">Storing a key and its value as a pair: </w:t>
-      </w:r>
-      <w:r>
-        <w:rPr>
-          <w:rFonts w:ascii="Consolas" w:hAnsi="Consolas"/>
-          <w:color w:val="802020"/>
-        </w:rPr>
-        <w:t>ContentAddressableMemory</w:t>
-      </w:r>
-      <w:r>
-        <w:t xml:space="preserve"> supports multiple fields, but its weighted (softmax) retrieval only works with </w:t>
-      </w:r>
-      <w:r>
-        <w:rPr>
-          <w:rFonts w:ascii="Consolas" w:hAnsi="Consolas"/>
-          <w:color w:val="802020"/>
-        </w:rPr>
-        <w:t>duplicate_entries_allowed=False</w:t>
-      </w:r>
-      <w:r>
-        <w:t xml:space="preserve"> (</w:t>
-      </w:r>
-      <w:r>
-        <w:rPr>
-          <w:rFonts w:ascii="Consolas" w:hAnsi="Consolas"/>
-          <w:color w:val="802020"/>
-        </w:rPr>
-        <w:t>memoryfunctions.py:1405-1417</w:t>
-      </w:r>
-      <w:r>
-        <w:t xml:space="preserve">). In that mode a repeated entry isn't stored: 3 inputs, one of them repeated, stored only 2 entries. </w:t>
-      </w:r>
-      <w:r>
-        <w:rPr>
-          <w:rFonts w:ascii="Consolas" w:hAnsi="Consolas"/>
-          <w:color w:val="802020"/>
-        </w:rPr>
-        <w:t>EMComposition</w:t>
-      </w:r>
-      <w:r>
-        <w:t xml:space="preserve"> stores key and value fields together, but it has a fixed capacity and doesn't allow adding nodes. In practice, it was simpler to keep keys and values in separate memories, aligned by slot.</w:t>
-      </w:r>
-    </w:p>
-    <w:p>
-      <w:pPr>
-        <w:pStyle w:val="ListBullet"/>
-      </w:pPr>
-      <w:r>
-        <w:t xml:space="preserve">Raw query-key dot products can't be read out of </w:t>
-      </w:r>
-      <w:r>
-        <w:rPr>
-          <w:rFonts w:ascii="Consolas" w:hAnsi="Consolas"/>
-          <w:color w:val="802020"/>
-        </w:rPr>
-        <w:t>EMComposition</w:t>
-      </w:r>
-      <w:r>
-        <w:t>. The key field's memory node runs twice per trial: the first run computes the raw scores (</w:t>
-      </w:r>
-      <w:r>
-        <w:rPr>
-          <w:rFonts w:ascii="Consolas" w:hAnsi="Consolas"/>
-          <w:color w:val="802020"/>
-        </w:rPr>
-        <w:t>[4, 3]</w:t>
-      </w:r>
-      <w:r>
-        <w:t xml:space="preserve">), and the second overwrites the same </w:t>
-      </w:r>
-      <w:r>
-        <w:rPr>
-          <w:rFonts w:ascii="Consolas" w:hAnsi="Consolas"/>
-          <w:color w:val="802020"/>
-        </w:rPr>
-        <w:t>SCORES</w:t>
-      </w:r>
-      <w:r>
-        <w:t xml:space="preserve"> output with softmaxed weights (</w:t>
-      </w:r>
-      <w:r>
-        <w:rPr>
-          <w:rFonts w:ascii="Consolas" w:hAnsi="Consolas"/>
-          <w:color w:val="802020"/>
-        </w:rPr>
-        <w:t>[0.7311, 0.2689]</w:t>
-      </w:r>
-      <w:r>
-        <w:t xml:space="preserve">). A node outside the EMComposition connected to </w:t>
-      </w:r>
-      <w:r>
-        <w:rPr>
-          <w:rFonts w:ascii="Consolas" w:hAnsi="Consolas"/>
-          <w:color w:val="802020"/>
-        </w:rPr>
-        <w:t>SCORES</w:t>
-      </w:r>
-      <w:r>
-        <w:t xml:space="preserve"> receives only the softmaxed values. Adding a node inside raises </w:t>
-      </w:r>
-      <w:r>
-        <w:rPr>
-          <w:rFonts w:ascii="Consolas" w:hAnsi="Consolas"/>
-          <w:color w:val="802020"/>
-        </w:rPr>
-        <w:t>Nodes cannot be added to an EMComposition</w:t>
-      </w:r>
-      <w:r>
-        <w:t xml:space="preserve">. Softmax can't be inverted, because it keeps only the differences between scores. Logging captures the raw scores, but only for inspection after the trial. Anything that needs per-key raw scores (e.g. ESBN's confidence gate, </w:t>
-      </w:r>
-      <w:r>
-        <w:rPr>
-          <w:rFonts w:ascii="Consolas" w:hAnsi="Consolas"/>
-          <w:color w:val="802020"/>
-        </w:rPr>
-        <w:t>σ(γ·s + β)</w:t>
-      </w:r>
-      <w:r>
-        <w:t>) can't be built on it.</w:t>
-      </w:r>
-    </w:p>
-    <w:p>
-      <w:pPr>
-        <w:pStyle w:val="ListBullet"/>
-      </w:pPr>
-      <w:r>
-        <w:t>Proposal: a separate raw-scores output that's only updated on the score-computing run, supported in EMComposition's PyTorch version as well.</w:t>
       </w:r>
     </w:p>
     <w:p>
@@ -911,178 +1227,6 @@
         <w:pStyle w:val="Heading2"/>
       </w:pPr>
       <w:r>
-        <w:t>Memory placeholders</w:t>
-      </w:r>
-    </w:p>
-    <w:p>
-      <w:pPr>
-        <w:pStyle w:val="ListBullet"/>
-      </w:pPr>
-      <w:r>
-        <w:t xml:space="preserve">A </w:t>
-      </w:r>
-      <w:r>
-        <w:rPr>
-          <w:rFonts w:ascii="Consolas" w:hAnsi="Consolas"/>
-          <w:color w:val="802020"/>
-        </w:rPr>
-        <w:t>Buffer</w:t>
-      </w:r>
-      <w:r>
-        <w:t xml:space="preserve"> with vector-valued entries can't be created empty: an empty </w:t>
-      </w:r>
-      <w:r>
-        <w:rPr>
-          <w:rFonts w:ascii="Consolas" w:hAnsi="Consolas"/>
-          <w:color w:val="802020"/>
-        </w:rPr>
-        <w:t>initializer</w:t>
-      </w:r>
-      <w:r>
-        <w:t xml:space="preserve"> raises </w:t>
-      </w:r>
-      <w:r>
-        <w:rPr>
-          <w:rFonts w:ascii="Consolas" w:hAnsi="Consolas"/>
-          <w:color w:val="802020"/>
-        </w:rPr>
-        <w:t>initializer ([]) is incompatible with its default_variable</w:t>
-      </w:r>
-      <w:r>
-        <w:t xml:space="preserve">. So it has to start with a placeholder, and nothing removes the placeholder automatically when the first real value arrives, so you get </w:t>
-      </w:r>
-      <w:r>
-        <w:rPr>
-          <w:rFonts w:ascii="Consolas" w:hAnsi="Consolas"/>
-          <w:color w:val="802020"/>
-        </w:rPr>
-        <w:t>[placeholder, v_0]</w:t>
-      </w:r>
-      <w:r>
-        <w:t xml:space="preserve">. </w:t>
-      </w:r>
-      <w:r>
-        <w:rPr>
-          <w:rFonts w:ascii="Consolas" w:hAnsi="Consolas"/>
-          <w:color w:val="802020"/>
-        </w:rPr>
-        <w:t>reset()</w:t>
-      </w:r>
-      <w:r>
-        <w:t xml:space="preserve"> restores the placeholder, and only </w:t>
-      </w:r>
-      <w:r>
-        <w:rPr>
-          <w:rFonts w:ascii="Consolas" w:hAnsi="Consolas"/>
-          <w:color w:val="802020"/>
-        </w:rPr>
-        <w:t>reset([])</w:t>
-      </w:r>
-      <w:r>
-        <w:t xml:space="preserve"> empties the memory.</w:t>
-      </w:r>
-    </w:p>
-    <w:p>
-      <w:pPr>
-        <w:pStyle w:val="ListBullet"/>
-      </w:pPr>
-      <w:r>
-        <w:rPr>
-          <w:rFonts w:ascii="Consolas" w:hAnsi="Consolas"/>
-          <w:color w:val="802020"/>
-        </w:rPr>
-        <w:t>ContentAddressableMemory</w:t>
-      </w:r>
-      <w:r>
-        <w:t xml:space="preserve"> is worse:</w:t>
-      </w:r>
-    </w:p>
-    <w:p>
-      <w:pPr>
-        <w:pStyle w:val="ListBullet2"/>
-      </w:pPr>
-      <w:r>
-        <w:t xml:space="preserve">Built without an initializer, its </w:t>
-      </w:r>
-      <w:r>
-        <w:rPr>
-          <w:rFonts w:ascii="Consolas" w:hAnsi="Consolas"/>
-          <w:color w:val="802020"/>
-        </w:rPr>
-        <w:t>reset()</w:t>
-      </w:r>
-      <w:r>
-        <w:t xml:space="preserve"> </w:t>
-      </w:r>
-      <w:r>
-        <w:rPr>
-          <w:b/>
-        </w:rPr>
-        <w:t>crashes</w:t>
-      </w:r>
-      <w:r>
-        <w:t xml:space="preserve"> (</w:t>
-      </w:r>
-      <w:r>
-        <w:rPr>
-          <w:rFonts w:ascii="Consolas" w:hAnsi="Consolas"/>
-          <w:color w:val="802020"/>
-        </w:rPr>
-        <w:t>'numpy.ndarray' object has no attribute 'clear'</w:t>
-      </w:r>
-      <w:r>
-        <w:t xml:space="preserve">, </w:t>
-      </w:r>
-      <w:r>
-        <w:rPr>
-          <w:rFonts w:ascii="Consolas" w:hAnsi="Consolas"/>
-          <w:color w:val="802020"/>
-        </w:rPr>
-        <w:t>memoryfunctions.py:1446</w:t>
-      </w:r>
-      <w:r>
-        <w:t>).</w:t>
-      </w:r>
-    </w:p>
-    <w:p>
-      <w:pPr>
-        <w:pStyle w:val="ListBullet2"/>
-      </w:pPr>
-      <w:r>
-        <w:t xml:space="preserve">An empty memory reports </w:t>
-      </w:r>
-      <w:r>
-        <w:rPr>
-          <w:rFonts w:ascii="Consolas" w:hAnsi="Consolas"/>
-          <w:color w:val="802020"/>
-        </w:rPr>
-        <w:t>[0]</w:t>
-      </w:r>
-      <w:r>
-        <w:t xml:space="preserve"> as its scores, which is indistinguishable from one stored key scoring 0.</w:t>
-      </w:r>
-    </w:p>
-    <w:p>
-      <w:pPr>
-        <w:pStyle w:val="ListBullet2"/>
-      </w:pPr>
-      <w:r>
-        <w:t>So in practice it needs a placeholder key whose score is dropped by hand.</w:t>
-      </w:r>
-    </w:p>
-    <w:p>
-      <w:pPr>
-        <w:pStyle w:val="ListBullet"/>
-      </w:pPr>
-      <w:r>
-        <w:t>Proposal: allow empty memories, or have a designated placeholder that's dropped on the first write.</w:t>
-      </w:r>
-    </w:p>
-    <w:p>
-      <w:pPr>
-        <w:pStyle w:val="Heading2"/>
-      </w:pPr>
-      <w:r>
         <w:t>Components without PyTorch support</w:t>
       </w:r>
     </w:p>

</xml_diff>

<commit_message>
Report: add why each memory alternative fails, remove bugs section
Co-Authored-By: Claude Opus 5.5 <noreply@anthropic.com>
Claude-Session: https://claude.ai/code/session_01Pj1PPavthJ9iFe8XHJiggU
</commit_message>
<xml_diff>
--- a/pnl_issues.docx
+++ b/pnl_issues.docx
@@ -466,6 +466,833 @@
       </w:pPr>
       <w:r>
         <w:t>Proposal: allow empty memories (an empty initializer with a declared entry shape), or a designated placeholder that's dropped on the first write. Also expose the number of stored entries, or a mask of filled slots, so padding and masking downstream don't depend on these conventions.</w:t>
+      </w:r>
+    </w:p>
+    <w:p>
+      <w:pPr>
+        <w:pStyle w:val="Heading1"/>
+      </w:pPr>
+      <w:r>
+        <w:t>What was tried, and why each alternative fails</w:t>
+      </w:r>
+    </w:p>
+    <w:p>
+      <w:r>
+        <w:t>Each approach below was built and run. Together they are why ESBN can't be built as a trainable PsyNeuLink model.</w:t>
+      </w:r>
+    </w:p>
+    <w:p>
+      <w:pPr>
+        <w:pStyle w:val="Heading2"/>
+      </w:pPr>
+      <w:r>
+        <w:t>1. ContentAddressableMemory (the approach in main.py)</w:t>
+      </w:r>
+    </w:p>
+    <w:p>
+      <w:pPr>
+        <w:ind w:left="360" w:hanging="360"/>
+      </w:pPr>
+      <w:r>
+        <w:t>1.</w:t>
+        <w:tab/>
+      </w:r>
+      <w:r>
+        <w:t xml:space="preserve">Each embedding is stored as a key, and the dot products with every stored key are read from its </w:t>
+      </w:r>
+      <w:r>
+        <w:rPr>
+          <w:rFonts w:ascii="Consolas" w:hAnsi="Consolas"/>
+          <w:color w:val="802020"/>
+        </w:rPr>
+        <w:t>distances_to_entries</w:t>
+      </w:r>
+      <w:r>
+        <w:t xml:space="preserve"> Parameter (dot-product metric). This part works in Python mode.</w:t>
+      </w:r>
+    </w:p>
+    <w:p>
+      <w:pPr>
+        <w:ind w:left="360" w:hanging="360"/>
+      </w:pPr>
+      <w:r>
+        <w:t>2.</w:t>
+        <w:tab/>
+      </w:r>
+      <w:r>
+        <w:t>The number of dot products grows by one per stored key, but edges have fixed sizes: a growing output crashes on the next trial (</w:t>
+      </w:r>
+      <w:r>
+        <w:rPr>
+          <w:rFonts w:ascii="Consolas" w:hAnsi="Consolas"/>
+          <w:color w:val="802020"/>
+        </w:rPr>
+        <w:t>shapes (2,) and (1,1) not aligned</w:t>
+      </w:r>
+      <w:r>
+        <w:t xml:space="preserve">). So a custom numpy function on the output port has to pad the dot products to </w:t>
+      </w:r>
+      <w:r>
+        <w:rPr>
+          <w:rFonts w:ascii="Consolas" w:hAnsi="Consolas"/>
+          <w:color w:val="802020"/>
+        </w:rPr>
+        <w:t>N_STIMULI</w:t>
+      </w:r>
+      <w:r>
+        <w:t>.</w:t>
+      </w:r>
+    </w:p>
+    <w:p>
+      <w:pPr>
+        <w:ind w:left="360" w:hanging="360"/>
+      </w:pPr>
+      <w:r>
+        <w:t>3.</w:t>
+        <w:tab/>
+      </w:r>
+      <w:r>
+        <w:t xml:space="preserve">It can't start empty: built without an initializer, its </w:t>
+      </w:r>
+      <w:r>
+        <w:rPr>
+          <w:rFonts w:ascii="Consolas" w:hAnsi="Consolas"/>
+          <w:color w:val="802020"/>
+        </w:rPr>
+        <w:t>reset()</w:t>
+      </w:r>
+      <w:r>
+        <w:t xml:space="preserve"> crashes, and an empty memory reports </w:t>
+      </w:r>
+      <w:r>
+        <w:rPr>
+          <w:rFonts w:ascii="Consolas" w:hAnsi="Consolas"/>
+          <w:color w:val="802020"/>
+        </w:rPr>
+        <w:t>[0]</w:t>
+      </w:r>
+      <w:r>
+        <w:t xml:space="preserve"> as its scores. So it starts with a placeholder key, whose score the padding function drops by position.</w:t>
+      </w:r>
+    </w:p>
+    <w:p>
+      <w:pPr>
+        <w:ind w:left="360" w:hanging="360"/>
+      </w:pPr>
+      <w:r>
+        <w:t>4.</w:t>
+        <w:tab/>
+      </w:r>
+      <w:r>
+        <w:t xml:space="preserve">It can't hold the values as well: weighted retrieval over key-value pairs only works with </w:t>
+      </w:r>
+      <w:r>
+        <w:rPr>
+          <w:rFonts w:ascii="Consolas" w:hAnsi="Consolas"/>
+          <w:color w:val="802020"/>
+        </w:rPr>
+        <w:t>duplicate_entries_allowed=False</w:t>
+      </w:r>
+      <w:r>
+        <w:t>, which doesn't store repeated entries. So the values need a second memory.</w:t>
+      </w:r>
+    </w:p>
+    <w:p>
+      <w:pPr>
+        <w:ind w:left="360" w:hanging="360"/>
+      </w:pPr>
+      <w:r>
+        <w:t>5.</w:t>
+        <w:tab/>
+      </w:r>
+      <w:r>
+        <w:t xml:space="preserve">It can't be trained: </w:t>
+      </w:r>
+      <w:r>
+        <w:rPr>
+          <w:rFonts w:ascii="Consolas" w:hAnsi="Consolas"/>
+          <w:color w:val="802020"/>
+        </w:rPr>
+        <w:t>learn()</w:t>
+      </w:r>
+      <w:r>
+        <w:t xml:space="preserve"> rejects it (</w:t>
+      </w:r>
+      <w:r>
+        <w:rPr>
+          <w:rFonts w:ascii="Consolas" w:hAnsi="Consolas"/>
+          <w:color w:val="802020"/>
+        </w:rPr>
+        <w:t>… is not currently supported by AutodiffComposition</w:t>
+      </w:r>
+      <w:r>
+        <w:t xml:space="preserve">), and the padding function would also need a </w:t>
+      </w:r>
+      <w:r>
+        <w:rPr>
+          <w:rFonts w:ascii="Consolas" w:hAnsi="Consolas"/>
+          <w:color w:val="802020"/>
+        </w:rPr>
+        <w:t>pytorch_function_generator</w:t>
+      </w:r>
+      <w:r>
+        <w:t>. This is the dead end: the model runs forward, but backpropagation isn't possible.</w:t>
+      </w:r>
+    </w:p>
+    <w:p>
+      <w:pPr>
+        <w:pStyle w:val="Heading2"/>
+      </w:pPr>
+      <w:r>
+        <w:t>2. Buffer (for esbn_vals)</w:t>
+      </w:r>
+    </w:p>
+    <w:p>
+      <w:pPr>
+        <w:ind w:left="360" w:hanging="360"/>
+      </w:pPr>
+      <w:r>
+        <w:t>1.</w:t>
+        <w:tab/>
+      </w:r>
+      <w:r>
+        <w:t xml:space="preserve">It accumulates one entry per trial, which is what </w:t>
+      </w:r>
+      <w:r>
+        <w:rPr>
+          <w:rFonts w:ascii="Consolas" w:hAnsi="Consolas"/>
+          <w:color w:val="802020"/>
+        </w:rPr>
+        <w:t>esbn_vals</w:t>
+      </w:r>
+      <w:r>
+        <w:t xml:space="preserve"> needs.</w:t>
+      </w:r>
+    </w:p>
+    <w:p>
+      <w:pPr>
+        <w:ind w:left="360" w:hanging="360"/>
+      </w:pPr>
+      <w:r>
+        <w:t>2.</w:t>
+        <w:tab/>
+      </w:r>
+      <w:r>
+        <w:t>The same fixed-size edge problem applies, and its default output port passes on only its first stored item, so the stored values also have to be padded by a custom function on an output port.</w:t>
+      </w:r>
+    </w:p>
+    <w:p>
+      <w:pPr>
+        <w:ind w:left="360" w:hanging="360"/>
+      </w:pPr>
+      <w:r>
+        <w:t>3.</w:t>
+        <w:tab/>
+      </w:r>
+      <w:r>
+        <w:t xml:space="preserve">It can't start empty with vector entries, the placeholder is never dropped, and </w:t>
+      </w:r>
+      <w:r>
+        <w:rPr>
+          <w:rFonts w:ascii="Consolas" w:hAnsi="Consolas"/>
+          <w:color w:val="802020"/>
+        </w:rPr>
+        <w:t>reset()</w:t>
+      </w:r>
+      <w:r>
+        <w:t xml:space="preserve"> restores it (only </w:t>
+      </w:r>
+      <w:r>
+        <w:rPr>
+          <w:rFonts w:ascii="Consolas" w:hAnsi="Consolas"/>
+          <w:color w:val="802020"/>
+        </w:rPr>
+        <w:t>reset([])</w:t>
+      </w:r>
+      <w:r>
+        <w:t xml:space="preserve"> empties it).</w:t>
+      </w:r>
+    </w:p>
+    <w:p>
+      <w:pPr>
+        <w:ind w:left="360" w:hanging="360"/>
+      </w:pPr>
+      <w:r>
+        <w:t>4.</w:t>
+        <w:tab/>
+      </w:r>
+      <w:r>
+        <w:rPr>
+          <w:rFonts w:ascii="Consolas" w:hAnsi="Consolas"/>
+          <w:color w:val="802020"/>
+        </w:rPr>
+        <w:t>learn()</w:t>
+      </w:r>
+      <w:r>
+        <w:t xml:space="preserve"> rejects it, for the same reason as </w:t>
+      </w:r>
+      <w:r>
+        <w:rPr>
+          <w:rFonts w:ascii="Consolas" w:hAnsi="Consolas"/>
+          <w:color w:val="802020"/>
+        </w:rPr>
+        <w:t>ContentAddressableMemory</w:t>
+      </w:r>
+      <w:r>
+        <w:t>.</w:t>
+      </w:r>
+    </w:p>
+    <w:p>
+      <w:pPr>
+        <w:pStyle w:val="Heading2"/>
+      </w:pPr>
+      <w:r>
+        <w:t>3. EMComposition</w:t>
+      </w:r>
+    </w:p>
+    <w:p>
+      <w:r>
+        <w:t xml:space="preserve">It solves the problems above: key and value fields in one memory, a fixed capacity (so no growing outputs), and PyTorch support. This version also has </w:t>
+      </w:r>
+      <w:r>
+        <w:rPr>
+          <w:rFonts w:ascii="Consolas" w:hAnsi="Consolas"/>
+          <w:color w:val="802020"/>
+        </w:rPr>
+        <w:t>full_sequence_mode</w:t>
+      </w:r>
+      <w:r>
+        <w:t xml:space="preserve"> (a whole sequence as one trial, backpropagated through time) and </w:t>
+      </w:r>
+      <w:r>
+        <w:rPr>
+          <w:rFonts w:ascii="Consolas" w:hAnsi="Consolas"/>
+          <w:color w:val="802020"/>
+        </w:rPr>
+        <w:t>differentiable_storage</w:t>
+      </w:r>
+      <w:r>
+        <w:t xml:space="preserve"> (gradients through stored entries, which ESBN needs); the repository's tests for both pass. It still fails for ESBN:</w:t>
+      </w:r>
+    </w:p>
+    <w:p>
+      <w:pPr>
+        <w:ind w:left="360" w:hanging="360"/>
+      </w:pPr>
+      <w:r>
+        <w:t>1.</w:t>
+        <w:tab/>
+      </w:r>
+      <w:r>
+        <w:t>It doesn't output the raw dot products. The key field's memory node runs more than once per trial: the first run computes the raw scores (</w:t>
+      </w:r>
+      <w:r>
+        <w:rPr>
+          <w:rFonts w:ascii="Consolas" w:hAnsi="Consolas"/>
+          <w:color w:val="802020"/>
+        </w:rPr>
+        <w:t>[4, 3]</w:t>
+      </w:r>
+      <w:r>
+        <w:t xml:space="preserve">), and a later run overwrites the same </w:t>
+      </w:r>
+      <w:r>
+        <w:rPr>
+          <w:rFonts w:ascii="Consolas" w:hAnsi="Consolas"/>
+          <w:color w:val="802020"/>
+        </w:rPr>
+        <w:t>SCORES</w:t>
+      </w:r>
+      <w:r>
+        <w:t xml:space="preserve"> output with the softmaxed weights (</w:t>
+      </w:r>
+      <w:r>
+        <w:rPr>
+          <w:rFonts w:ascii="Consolas" w:hAnsi="Consolas"/>
+          <w:color w:val="802020"/>
+        </w:rPr>
+        <w:t>[0.7311, 0.2689]</w:t>
+      </w:r>
+      <w:r>
+        <w:t xml:space="preserve">). A node outside the EMComposition receives only the softmaxed values, nodes can't be added inside it, and softmax can't be inverted. ESBN's confidence gate, </w:t>
+      </w:r>
+      <w:r>
+        <w:rPr>
+          <w:rFonts w:ascii="Consolas" w:hAnsi="Consolas"/>
+          <w:color w:val="802020"/>
+        </w:rPr>
+        <w:t>σ(γ·s + β)</w:t>
+      </w:r>
+      <w:r>
+        <w:t>, needs the raw scores.</w:t>
+      </w:r>
+    </w:p>
+    <w:p>
+      <w:pPr>
+        <w:ind w:left="360" w:hanging="360"/>
+      </w:pPr>
+      <w:r>
+        <w:t>2.</w:t>
+        <w:tab/>
+      </w:r>
+      <w:r>
+        <w:t xml:space="preserve">Reading the </w:t>
+      </w:r>
+      <w:r>
+        <w:rPr>
+          <w:rFonts w:ascii="Consolas" w:hAnsi="Consolas"/>
+          <w:color w:val="802020"/>
+        </w:rPr>
+        <w:t>SCORES</w:t>
+      </w:r>
+      <w:r>
+        <w:t xml:space="preserve"> port from outside also breaks training: in an AutodiffComposition, a projection from it to an outside node makes the learning setup crash (</w:t>
+      </w:r>
+      <w:r>
+        <w:rPr>
+          <w:rFonts w:ascii="Consolas" w:hAnsi="Consolas"/>
+          <w:color w:val="802020"/>
+        </w:rPr>
+        <w:t>IndexError</w:t>
+      </w:r>
+      <w:r>
+        <w:t xml:space="preserve"> in </w:t>
+      </w:r>
+      <w:r>
+        <w:rPr>
+          <w:rFonts w:ascii="Consolas" w:hAnsi="Consolas"/>
+          <w:color w:val="802020"/>
+        </w:rPr>
+        <w:t>_add_dependency</w:t>
+      </w:r>
+      <w:r>
+        <w:t xml:space="preserve">, </w:t>
+      </w:r>
+      <w:r>
+        <w:rPr>
+          <w:rFonts w:ascii="Consolas" w:hAnsi="Consolas"/>
+          <w:color w:val="802020"/>
+        </w:rPr>
+        <w:t>autodiffcomposition.py:2384</w:t>
+      </w:r>
+      <w:r>
+        <w:t>), whether the projection is added after construction or given in the pathways.</w:t>
+      </w:r>
+    </w:p>
+    <w:p>
+      <w:pPr>
+        <w:ind w:left="360" w:hanging="360"/>
+      </w:pPr>
+      <w:r>
+        <w:t>3.</w:t>
+        <w:tab/>
+      </w:r>
+      <w:r>
+        <w:t xml:space="preserve">Storage and retrieval can't be controlled separately. Every execution retrieves and then stores. </w:t>
+      </w:r>
+      <w:r>
+        <w:rPr>
+          <w:rFonts w:ascii="Consolas" w:hAnsi="Consolas"/>
+          <w:color w:val="802020"/>
+        </w:rPr>
+        <w:t>storage_prob</w:t>
+      </w:r>
+      <w:r>
+        <w:t xml:space="preserve"> only takes effect at construction: setting it to 0 afterwards (as a Parameter or as an attribute) didn't stop storage, and built with 0 it never stores.</w:t>
+      </w:r>
+    </w:p>
+    <w:p>
+      <w:pPr>
+        <w:ind w:left="360" w:hanging="360"/>
+      </w:pPr>
+      <w:r>
+        <w:t>4.</w:t>
+        <w:tab/>
+      </w:r>
+      <w:r>
+        <w:t xml:space="preserve">It can't be cleared between sequences: </w:t>
+      </w:r>
+      <w:r>
+        <w:rPr>
+          <w:rFonts w:ascii="Consolas" w:hAnsi="Consolas"/>
+          <w:color w:val="802020"/>
+        </w:rPr>
+        <w:t>reset()</w:t>
+      </w:r>
+      <w:r>
+        <w:t xml:space="preserve"> leaves the stored entries in place.</w:t>
+      </w:r>
+    </w:p>
+    <w:p>
+      <w:pPr>
+        <w:ind w:left="360" w:hanging="360"/>
+      </w:pPr>
+      <w:r>
+        <w:t>5.</w:t>
+        <w:tab/>
+      </w:r>
+      <w:r>
+        <w:t xml:space="preserve">Empty slots are filled with </w:t>
+      </w:r>
+      <w:r>
+        <w:rPr>
+          <w:rFonts w:ascii="Consolas" w:hAnsi="Consolas"/>
+          <w:color w:val="802020"/>
+        </w:rPr>
+        <w:t>memory_fill</w:t>
+      </w:r>
+      <w:r>
+        <w:t xml:space="preserve"> and take part in retrieval. With </w:t>
+      </w:r>
+      <w:r>
+        <w:rPr>
+          <w:rFonts w:ascii="Consolas" w:hAnsi="Consolas"/>
+          <w:color w:val="802020"/>
+        </w:rPr>
+        <w:t>softmax_threshold=None</w:t>
+      </w:r>
+      <w:r>
+        <w:t xml:space="preserve">, stored scores </w:t>
+      </w:r>
+      <w:r>
+        <w:rPr>
+          <w:rFonts w:ascii="Consolas" w:hAnsi="Consolas"/>
+          <w:color w:val="802020"/>
+        </w:rPr>
+        <w:t>[4, 3]</w:t>
+      </w:r>
+      <w:r>
+        <w:t xml:space="preserve"> and two empty slots, it retrieved </w:t>
+      </w:r>
+      <w:r>
+        <w:rPr>
+          <w:rFonts w:ascii="Consolas" w:hAnsi="Consolas"/>
+          <w:color w:val="802020"/>
+        </w:rPr>
+        <w:t>1.236</w:t>
+      </w:r>
+      <w:r>
+        <w:t xml:space="preserve"> instead of </w:t>
+      </w:r>
+      <w:r>
+        <w:rPr>
+          <w:rFonts w:ascii="Consolas" w:hAnsi="Consolas"/>
+          <w:color w:val="802020"/>
+        </w:rPr>
+        <w:t>1.269</w:t>
+      </w:r>
+      <w:r>
+        <w:t xml:space="preserve">. The default </w:t>
+      </w:r>
+      <w:r>
+        <w:rPr>
+          <w:rFonts w:ascii="Consolas" w:hAnsi="Consolas"/>
+          <w:color w:val="802020"/>
+        </w:rPr>
+        <w:t>softmax_threshold=.001</w:t>
+      </w:r>
+      <w:r>
+        <w:t xml:space="preserve"> masks the empty slots, but also real scores of 0: with one stored key scoring exactly 0, nothing was retrieved.</w:t>
+      </w:r>
+    </w:p>
+    <w:p>
+      <w:pPr>
+        <w:ind w:left="360" w:hanging="360"/>
+      </w:pPr>
+      <w:r>
+        <w:t>6.</w:t>
+        <w:tab/>
+      </w:r>
+      <w:r>
+        <w:t xml:space="preserve">Other defaults change retrieval: </w:t>
+      </w:r>
+      <w:r>
+        <w:rPr>
+          <w:rFonts w:ascii="Consolas" w:hAnsi="Consolas"/>
+          <w:color w:val="802020"/>
+        </w:rPr>
+        <w:t>normalize_memories=True</w:t>
+      </w:r>
+      <w:r>
+        <w:t xml:space="preserve"> gives cosine similarity instead of the dot product, and </w:t>
+      </w:r>
+      <w:r>
+        <w:rPr>
+          <w:rFonts w:ascii="Consolas" w:hAnsi="Consolas"/>
+          <w:color w:val="802020"/>
+        </w:rPr>
+        <w:t>memory_decay_rate=AUTO</w:t>
+      </w:r>
+      <w:r>
+        <w:t xml:space="preserve"> decays stored entries.</w:t>
+      </w:r>
+    </w:p>
+    <w:p>
+      <w:pPr>
+        <w:pStyle w:val="Heading2"/>
+      </w:pPr>
+      <w:r>
+        <w:t>4. MatrixMemory (EMComposition's internal memory)</w:t>
+      </w:r>
+    </w:p>
+    <w:p>
+      <w:pPr>
+        <w:ind w:left="360" w:hanging="360"/>
+      </w:pPr>
+      <w:r>
+        <w:t>1.</w:t>
+        <w:tab/>
+      </w:r>
+      <w:r>
+        <w:t>It can't be constructed on its own: the constructor runs the function without saying which operation to perform (compute scores, retrieve or store), and building the resulting error message crashes (</w:t>
+      </w:r>
+      <w:r>
+        <w:rPr>
+          <w:rFonts w:ascii="Consolas" w:hAnsi="Consolas"/>
+          <w:color w:val="802020"/>
+        </w:rPr>
+        <w:t>'NoneType' object has no attribute 'name'</w:t>
+      </w:r>
+      <w:r>
+        <w:t>).</w:t>
+      </w:r>
+    </w:p>
+    <w:p>
+      <w:pPr>
+        <w:pStyle w:val="Heading2"/>
+      </w:pPr>
+      <w:r>
+        <w:t>5. Custom PyTorch memory inside PsyNeuLink</w:t>
+      </w:r>
+    </w:p>
+    <w:p>
+      <w:r>
+        <w:t>The memories were written as custom functions (</w:t>
+      </w:r>
+      <w:r>
+        <w:rPr>
+          <w:rFonts w:ascii="Consolas" w:hAnsi="Consolas"/>
+          <w:color w:val="802020"/>
+        </w:rPr>
+        <w:t>UserDefinedFunction</w:t>
+      </w:r>
+      <w:r>
+        <w:t xml:space="preserve"> with a </w:t>
+      </w:r>
+      <w:r>
+        <w:rPr>
+          <w:rFonts w:ascii="Consolas" w:hAnsi="Consolas"/>
+          <w:color w:val="802020"/>
+        </w:rPr>
+        <w:t>pytorch_function_generator</w:t>
+      </w:r>
+      <w:r>
+        <w:t xml:space="preserve">), with the stored entries carried from step to step by feedback projections, and each sequence run as one trial in </w:t>
+      </w:r>
+      <w:r>
+        <w:rPr>
+          <w:rFonts w:ascii="Consolas" w:hAnsi="Consolas"/>
+          <w:color w:val="802020"/>
+        </w:rPr>
+        <w:t>full_sequence_mode</w:t>
+      </w:r>
+      <w:r>
+        <w:t>. A loop through a second node does carry values across steps, and backpropagation through it gave the correct gradients on a small example. Getting the full model to train needed these workarounds, each found by running it:</w:t>
+      </w:r>
+    </w:p>
+    <w:p>
+      <w:pPr>
+        <w:ind w:left="360" w:hanging="360"/>
+      </w:pPr>
+      <w:r>
+        <w:t>1.</w:t>
+        <w:tab/>
+      </w:r>
+      <w:r>
+        <w:t>A projection from a node to itself is dropped in PyTorch mode (nothing accumulated), so each memory loops through a second "delay" node.</w:t>
+      </w:r>
+    </w:p>
+    <w:p>
+      <w:pPr>
+        <w:ind w:left="360" w:hanging="360"/>
+      </w:pPr>
+      <w:r>
+        <w:t>2.</w:t>
+        <w:tab/>
+      </w:r>
+      <w:r>
+        <w:rPr>
+          <w:rFonts w:ascii="Consolas" w:hAnsi="Consolas"/>
+          <w:color w:val="802020"/>
+        </w:rPr>
+        <w:t>add_projection(..., feedback=True)</w:t>
+      </w:r>
+      <w:r>
+        <w:t xml:space="preserve"> isn't enough for learning: the learning setup reports a cycle unless the projection itself is constructed with </w:t>
+      </w:r>
+      <w:r>
+        <w:rPr>
+          <w:rFonts w:ascii="Consolas" w:hAnsi="Consolas"/>
+          <w:color w:val="802020"/>
+        </w:rPr>
+        <w:t>feedback=True</w:t>
+      </w:r>
+      <w:r>
+        <w:t>.</w:t>
+      </w:r>
+    </w:p>
+    <w:p>
+      <w:pPr>
+        <w:ind w:left="360" w:hanging="360"/>
+      </w:pPr>
+      <w:r>
+        <w:t>3.</w:t>
+        <w:tab/>
+      </w:r>
+      <w:r>
+        <w:t xml:space="preserve">A feedback projection into the nested </w:t>
+      </w:r>
+      <w:r>
+        <w:rPr>
+          <w:rFonts w:ascii="Consolas" w:hAnsi="Consolas"/>
+          <w:color w:val="802020"/>
+        </w:rPr>
+        <w:t>GRUComposition</w:t>
+      </w:r>
+      <w:r>
+        <w:t xml:space="preserve"> fails either way: constructed with </w:t>
+      </w:r>
+      <w:r>
+        <w:rPr>
+          <w:rFonts w:ascii="Consolas" w:hAnsi="Consolas"/>
+          <w:color w:val="802020"/>
+        </w:rPr>
+        <w:t>feedback=True</w:t>
+      </w:r>
+      <w:r>
+        <w:t xml:space="preserve"> it raises a </w:t>
+      </w:r>
+      <w:r>
+        <w:rPr>
+          <w:rFonts w:ascii="Consolas" w:hAnsi="Consolas"/>
+          <w:color w:val="802020"/>
+        </w:rPr>
+        <w:t>KeyError</w:t>
+      </w:r>
+      <w:r>
+        <w:t>, and without it the learning setup reports a cycle. So the feedback has to end at a plain node in front of the GRU.</w:t>
+      </w:r>
+    </w:p>
+    <w:p>
+      <w:pPr>
+        <w:ind w:left="360" w:hanging="360"/>
+      </w:pPr>
+      <w:r>
+        <w:t>4.</w:t>
+        <w:tab/>
+      </w:r>
+      <w:r>
+        <w:t>Before a feedback projection's sender has run, the projection sends a default the size of its receiver through its matrix, which crashes unless the matrix is square.</w:t>
+      </w:r>
+    </w:p>
+    <w:p>
+      <w:pPr>
+        <w:ind w:left="360" w:hanging="360"/>
+      </w:pPr>
+      <w:r>
+        <w:t>5.</w:t>
+        <w:tab/>
+      </w:r>
+      <w:r>
+        <w:rPr>
+          <w:rFonts w:ascii="Consolas" w:hAnsi="Consolas"/>
+          <w:color w:val="802020"/>
+        </w:rPr>
+        <w:t>DEFAULT_INPUT: DEFAULT_VARIABLE</w:t>
+      </w:r>
+      <w:r>
+        <w:t xml:space="preserve"> in a port specification dict is ignored, so </w:t>
+      </w:r>
+      <w:r>
+        <w:rPr>
+          <w:rFonts w:ascii="Consolas" w:hAnsi="Consolas"/>
+          <w:color w:val="802020"/>
+        </w:rPr>
+        <w:t>const_one</w:t>
+      </w:r>
+      <w:r>
+        <w:t xml:space="preserve"> is an ordinary INPUT node rather than a BIAS node; it has to be given as an </w:t>
+      </w:r>
+      <w:r>
+        <w:rPr>
+          <w:rFonts w:ascii="Consolas" w:hAnsi="Consolas"/>
+          <w:color w:val="802020"/>
+        </w:rPr>
+        <w:t>InputPort</w:t>
+      </w:r>
+      <w:r>
+        <w:t xml:space="preserve"> object.</w:t>
+      </w:r>
+    </w:p>
+    <w:p>
+      <w:pPr>
+        <w:ind w:left="360" w:hanging="360"/>
+      </w:pPr>
+      <w:r>
+        <w:t>6.</w:t>
+        <w:tab/>
+      </w:r>
+      <w:r>
+        <w:t>The memory carried over from the previous minibatch keeps its autograd graph, so the next backward pass fails (</w:t>
+      </w:r>
+      <w:r>
+        <w:rPr>
+          <w:rFonts w:ascii="Consolas" w:hAnsi="Consolas"/>
+          <w:color w:val="802020"/>
+        </w:rPr>
+        <w:t>one of the variables needed for gradient computation has been modified by an inplace operation</w:t>
+      </w:r>
+      <w:r>
+        <w:t>). The memories have to be replaced with new zero tensors at the end of each sequence.</w:t>
+      </w:r>
+    </w:p>
+    <w:p>
+      <w:pPr>
+        <w:ind w:left="360" w:hanging="360"/>
+      </w:pPr>
+      <w:r>
+        <w:t>7.</w:t>
+        <w:tab/>
+      </w:r>
+      <w:r>
+        <w:t>Copying the GRU's node values back from PyTorch fails for minibatches of more than one sequence (a shape-mismatch assertion), so node-value copying has to be turned off.</w:t>
+      </w:r>
+    </w:p>
+    <w:p>
+      <w:pPr>
+        <w:ind w:left="360" w:hanging="360"/>
+      </w:pPr>
+      <w:r>
+        <w:t>8.</w:t>
+        <w:tab/>
+      </w:r>
+      <w:r>
+        <w:t xml:space="preserve">Testing with </w:t>
+      </w:r>
+      <w:r>
+        <w:rPr>
+          <w:rFonts w:ascii="Consolas" w:hAnsi="Consolas"/>
+          <w:color w:val="802020"/>
+        </w:rPr>
+        <w:t>learn(learning_rate=0)</w:t>
+      </w:r>
+      <w:r>
+        <w:t xml:space="preserve"> doesn't revert: later training no longer changed the weights.</w:t>
+      </w:r>
+    </w:p>
+    <w:p>
+      <w:r>
+        <w:t>With these, the model trains (32 sequences in about 6 seconds), but it hasn't been checked against the plain-PyTorch version, and the memory itself is PyTorch code inside custom functions: PsyNeuLink only provides the wiring. The plain-PyTorch ESBN, with the memory as ordinary Python lists, reached 100% accuracy on objects it never saw in training in one run (88% in another, from a different random start).</w:t>
       </w:r>
     </w:p>
     <w:p>
@@ -1086,7 +1913,27 @@
               <w:t>Logistic</w:t>
             </w:r>
             <w:r>
-              <w:t>, its PyTorch gradient is NaN (see bugs), so the confidence path needs a separate 0-padded output</w:t>
+              <w:t xml:space="preserve">, its PyTorch gradient is NaN (it is written as </w:t>
+            </w:r>
+            <w:r>
+              <w:rPr>
+                <w:rFonts w:ascii="Consolas" w:hAnsi="Consolas"/>
+                <w:color w:val="802020"/>
+              </w:rPr>
+              <w:t>1 / (1 + exp(-x))</w:t>
+            </w:r>
+            <w:r>
+              <w:t xml:space="preserve">, which gives NaN at </w:t>
+            </w:r>
+            <w:r>
+              <w:rPr>
+                <w:rFonts w:ascii="Consolas" w:hAnsi="Consolas"/>
+                <w:color w:val="802020"/>
+              </w:rPr>
+              <w:t>x = -1e9</w:t>
+            </w:r>
+            <w:r>
+              <w:t>), so the confidence path needs a separate 0-padded output</w:t>
             </w:r>
           </w:p>
         </w:tc>
@@ -1482,431 +2329,6 @@
         <w:pStyle w:val="Heading1"/>
       </w:pPr>
       <w:r>
-        <w:t>Bugs and sharp edges found along the way</w:t>
-      </w:r>
-    </w:p>
-    <w:p>
-      <w:pPr>
-        <w:pStyle w:val="ListBullet"/>
-      </w:pPr>
-      <w:r>
-        <w:rPr>
-          <w:rFonts w:ascii="Consolas" w:hAnsi="Consolas"/>
-          <w:color w:val="802020"/>
-        </w:rPr>
-        <w:t>add_projection</w:t>
-      </w:r>
-      <w:r>
-        <w:t xml:space="preserve"> drops </w:t>
-      </w:r>
-      <w:r>
-        <w:rPr>
-          <w:rFonts w:ascii="Consolas" w:hAnsi="Consolas"/>
-          <w:color w:val="802020"/>
-        </w:rPr>
-        <w:t>feedback=True</w:t>
-      </w:r>
-      <w:r>
-        <w:t xml:space="preserve"> when the projection is already built and targets a node inside a nested composition. It re-creates the projection without passing </w:t>
-      </w:r>
-      <w:r>
-        <w:rPr>
-          <w:rFonts w:ascii="Consolas" w:hAnsi="Consolas"/>
-          <w:color w:val="802020"/>
-        </w:rPr>
-        <w:t>feedback</w:t>
-      </w:r>
-      <w:r>
-        <w:t xml:space="preserve"> along (</w:t>
-      </w:r>
-      <w:r>
-        <w:rPr>
-          <w:rFonts w:ascii="Consolas" w:hAnsi="Consolas"/>
-          <w:color w:val="802020"/>
-        </w:rPr>
-        <w:t>composition.py:6396-6422</w:t>
-      </w:r>
-      <w:r>
-        <w:t xml:space="preserve">). The loop then runs as an ordinary cycle, with the nested composition and its feedback sender run together, each reading the previous trial's values, and there's no error. Giving the sender and receiver to </w:t>
-      </w:r>
-      <w:r>
-        <w:rPr>
-          <w:rFonts w:ascii="Consolas" w:hAnsi="Consolas"/>
-          <w:color w:val="802020"/>
-        </w:rPr>
-        <w:t>add_projection</w:t>
-      </w:r>
-      <w:r>
-        <w:t xml:space="preserve"> instead keeps the feedback designation.</w:t>
-      </w:r>
-    </w:p>
-    <w:p>
-      <w:pPr>
-        <w:pStyle w:val="ListBullet"/>
-      </w:pPr>
-      <w:r>
-        <w:t xml:space="preserve">A node whose only incoming edge is a feedback edge becomes an </w:t>
-      </w:r>
-      <w:r>
-        <w:rPr>
-          <w:rFonts w:ascii="Consolas" w:hAnsi="Consolas"/>
-          <w:color w:val="802020"/>
-        </w:rPr>
-        <w:t>INPUT</w:t>
-      </w:r>
-      <w:r>
-        <w:t xml:space="preserve"> node that expects external input, and a node whose only outgoing edge is a feedback edge becomes an </w:t>
-      </w:r>
-      <w:r>
-        <w:rPr>
-          <w:rFonts w:ascii="Consolas" w:hAnsi="Consolas"/>
-          <w:color w:val="802020"/>
-        </w:rPr>
-        <w:t>OUTPUT</w:t>
-      </w:r>
-      <w:r>
-        <w:t xml:space="preserve"> node. Both need </w:t>
-      </w:r>
-      <w:r>
-        <w:rPr>
-          <w:rFonts w:ascii="Consolas" w:hAnsi="Consolas"/>
-          <w:color w:val="802020"/>
-        </w:rPr>
-        <w:t>exclude_node_roles</w:t>
-      </w:r>
-      <w:r>
-        <w:t>.</w:t>
-      </w:r>
-    </w:p>
-    <w:p>
-      <w:pPr>
-        <w:pStyle w:val="ListBullet"/>
-      </w:pPr>
-      <w:r>
-        <w:t xml:space="preserve">PyTorch </w:t>
-      </w:r>
-      <w:r>
-        <w:rPr>
-          <w:rFonts w:ascii="Consolas" w:hAnsi="Consolas"/>
-          <w:color w:val="802020"/>
-        </w:rPr>
-        <w:t>Logistic</w:t>
-      </w:r>
-      <w:r>
-        <w:t xml:space="preserve"> is written as </w:t>
-      </w:r>
-      <w:r>
-        <w:rPr>
-          <w:rFonts w:ascii="Consolas" w:hAnsi="Consolas"/>
-          <w:color w:val="802020"/>
-        </w:rPr>
-        <w:t>1 / (1 + exp(-x))</w:t>
-      </w:r>
-      <w:r>
-        <w:t xml:space="preserve"> (</w:t>
-      </w:r>
-      <w:r>
-        <w:rPr>
-          <w:rFonts w:ascii="Consolas" w:hAnsi="Consolas"/>
-          <w:color w:val="802020"/>
-        </w:rPr>
-        <w:t>transferfunctions.py:1241</w:t>
-      </w:r>
-      <w:r>
-        <w:t xml:space="preserve">). At </w:t>
-      </w:r>
-      <w:r>
-        <w:rPr>
-          <w:rFonts w:ascii="Consolas" w:hAnsi="Consolas"/>
-          <w:color w:val="802020"/>
-        </w:rPr>
-        <w:t>x = -1e9</w:t>
-      </w:r>
-      <w:r>
-        <w:t xml:space="preserve"> its gradient is NaN, where </w:t>
-      </w:r>
-      <w:r>
-        <w:rPr>
-          <w:rFonts w:ascii="Consolas" w:hAnsi="Consolas"/>
-          <w:color w:val="802020"/>
-        </w:rPr>
-        <w:t>torch.sigmoid</w:t>
-      </w:r>
-      <w:r>
-        <w:t xml:space="preserve">'s is </w:t>
-      </w:r>
-      <w:r>
-        <w:rPr>
-          <w:rFonts w:ascii="Consolas" w:hAnsi="Consolas"/>
-          <w:color w:val="802020"/>
-        </w:rPr>
-        <w:t>0.0</w:t>
-      </w:r>
-      <w:r>
-        <w:t>.</w:t>
-      </w:r>
-    </w:p>
-    <w:p>
-      <w:pPr>
-        <w:pStyle w:val="ListBullet"/>
-      </w:pPr>
-      <w:r>
-        <w:rPr>
-          <w:rFonts w:ascii="Consolas" w:hAnsi="Consolas"/>
-          <w:color w:val="802020"/>
-        </w:rPr>
-        <w:t>SoftMax(mask_threshold=…)</w:t>
-      </w:r>
-      <w:r>
-        <w:t>: the NaN for an all-empty row batched with other rows, the masking of real zeros, and the warning on every call are shown in the masking table above.</w:t>
-      </w:r>
-    </w:p>
-    <w:p>
-      <w:pPr>
-        <w:pStyle w:val="ListBullet"/>
-      </w:pPr>
-      <w:r>
-        <w:rPr>
-          <w:rFonts w:ascii="Consolas" w:hAnsi="Consolas"/>
-          <w:color w:val="802020"/>
-        </w:rPr>
-        <w:t>EMComposition</w:t>
-      </w:r>
-      <w:r>
-        <w:t>:</w:t>
-      </w:r>
-    </w:p>
-    <w:p>
-      <w:pPr>
-        <w:pStyle w:val="ListBullet2"/>
-      </w:pPr>
-      <w:r>
-        <w:rPr>
-          <w:rFonts w:ascii="Consolas" w:hAnsi="Consolas"/>
-          <w:color w:val="802020"/>
-        </w:rPr>
-        <w:t>COMBINED SCORES</w:t>
-      </w:r>
-      <w:r>
-        <w:t xml:space="preserve"> also runs twice per trial, so its final value is a softmax applied twice (</w:t>
-      </w:r>
-      <w:r>
-        <w:rPr>
-          <w:rFonts w:ascii="Consolas" w:hAnsi="Consolas"/>
-          <w:color w:val="802020"/>
-        </w:rPr>
-        <w:t>[0.6135, 0.3865]</w:t>
-      </w:r>
-      <w:r>
-        <w:t xml:space="preserve">; the correct weights are </w:t>
-      </w:r>
-      <w:r>
-        <w:rPr>
-          <w:rFonts w:ascii="Consolas" w:hAnsi="Consolas"/>
-          <w:color w:val="802020"/>
-        </w:rPr>
-        <w:t>[0.7311, 0.2689]</w:t>
-      </w:r>
-      <w:r>
-        <w:t>).</w:t>
-      </w:r>
-    </w:p>
-    <w:p>
-      <w:pPr>
-        <w:pStyle w:val="ListBullet2"/>
-      </w:pPr>
-      <w:r>
-        <w:t>Three defaults silently change retrieval:</w:t>
-      </w:r>
-    </w:p>
-    <w:p>
-      <w:pPr>
-        <w:pStyle w:val="ListBullet3"/>
-      </w:pPr>
-      <w:r>
-        <w:rPr>
-          <w:rFonts w:ascii="Consolas" w:hAnsi="Consolas"/>
-          <w:color w:val="802020"/>
-        </w:rPr>
-        <w:t>normalize_memories=True</w:t>
-      </w:r>
-      <w:r>
-        <w:t xml:space="preserve"> gives cosine similarity (</w:t>
-      </w:r>
-      <w:r>
-        <w:rPr>
-          <w:rFonts w:ascii="Consolas" w:hAnsi="Consolas"/>
-          <w:color w:val="802020"/>
-        </w:rPr>
-        <w:t>[0.730, 0.408]</w:t>
-      </w:r>
-      <w:r>
-        <w:t>) instead of the raw dot product (</w:t>
-      </w:r>
-      <w:r>
-        <w:rPr>
-          <w:rFonts w:ascii="Consolas" w:hAnsi="Consolas"/>
-          <w:color w:val="802020"/>
-        </w:rPr>
-        <w:t>[4, 3]</w:t>
-      </w:r>
-      <w:r>
-        <w:t>).</w:t>
-      </w:r>
-    </w:p>
-    <w:p>
-      <w:pPr>
-        <w:pStyle w:val="ListBullet3"/>
-      </w:pPr>
-      <w:r>
-        <w:rPr>
-          <w:rFonts w:ascii="Consolas" w:hAnsi="Consolas"/>
-          <w:color w:val="802020"/>
-        </w:rPr>
-        <w:t>memory_decay_rate=AUTO</w:t>
-      </w:r>
-      <w:r>
-        <w:t xml:space="preserve"> decays stored memories: a stored key </w:t>
-      </w:r>
-      <w:r>
-        <w:rPr>
-          <w:rFonts w:ascii="Consolas" w:hAnsi="Consolas"/>
-          <w:color w:val="802020"/>
-        </w:rPr>
-        <w:t>[1, 0, 2]</w:t>
-      </w:r>
-      <w:r>
-        <w:t xml:space="preserve"> became </w:t>
-      </w:r>
-      <w:r>
-        <w:rPr>
-          <w:rFonts w:ascii="Consolas" w:hAnsi="Consolas"/>
-          <w:color w:val="802020"/>
-        </w:rPr>
-        <w:t>[0.56, 0, 1.13]</w:t>
-      </w:r>
-      <w:r>
-        <w:t xml:space="preserve"> after two more trials.</w:t>
-      </w:r>
-    </w:p>
-    <w:p>
-      <w:pPr>
-        <w:pStyle w:val="ListBullet3"/>
-      </w:pPr>
-      <w:r>
-        <w:rPr>
-          <w:rFonts w:ascii="Consolas" w:hAnsi="Consolas"/>
-          <w:color w:val="802020"/>
-        </w:rPr>
-        <w:t>softmax_threshold=.001</w:t>
-      </w:r>
-      <w:r>
-        <w:t xml:space="preserve"> masks real scores of 0: with one stored key scoring exactly 0, nothing was retrieved.</w:t>
-      </w:r>
-    </w:p>
-    <w:p>
-      <w:pPr>
-        <w:pStyle w:val="ListBullet"/>
-      </w:pPr>
-      <w:r>
-        <w:rPr>
-          <w:rFonts w:ascii="Consolas" w:hAnsi="Consolas"/>
-          <w:color w:val="802020"/>
-        </w:rPr>
-        <w:t>Buffer</w:t>
-      </w:r>
-      <w:r>
-        <w:t xml:space="preserve">: its docstring says </w:t>
-      </w:r>
-      <w:r>
-        <w:rPr>
-          <w:rFonts w:ascii="Consolas" w:hAnsi="Consolas"/>
-          <w:color w:val="802020"/>
-        </w:rPr>
-        <w:t>previous_value</w:t>
-      </w:r>
-      <w:r>
-        <w:t xml:space="preserve"> is the list </w:t>
-      </w:r>
-      <w:r>
-        <w:rPr>
-          <w:i/>
-        </w:rPr>
-        <w:t>before</w:t>
-      </w:r>
-      <w:r>
-        <w:t xml:space="preserve"> the current input is appended (</w:t>
-      </w:r>
-      <w:r>
-        <w:rPr>
-          <w:rFonts w:ascii="Consolas" w:hAnsi="Consolas"/>
-          <w:color w:val="802020"/>
-        </w:rPr>
-        <w:t>memoryfunctions.py:184</w:t>
-      </w:r>
-      <w:r>
-        <w:t xml:space="preserve">), but output ports see it </w:t>
-      </w:r>
-      <w:r>
-        <w:rPr>
-          <w:i/>
-        </w:rPr>
-        <w:t>after</w:t>
-      </w:r>
-      <w:r>
-        <w:t>.</w:t>
-      </w:r>
-    </w:p>
-    <w:p>
-      <w:pPr>
-        <w:pStyle w:val="ListBullet"/>
-      </w:pPr>
-      <w:r>
-        <w:rPr>
-          <w:rFonts w:ascii="Consolas" w:hAnsi="Consolas"/>
-          <w:color w:val="802020"/>
-        </w:rPr>
-        <w:t>ContentAddressableMemory.distances_to_entries</w:t>
-      </w:r>
-      <w:r>
-        <w:t xml:space="preserve"> defaults to </w:t>
-      </w:r>
-      <w:r>
-        <w:rPr>
-          <w:rFonts w:ascii="Consolas" w:hAnsi="Consolas"/>
-          <w:color w:val="802020"/>
-        </w:rPr>
-        <w:t>[0]</w:t>
-      </w:r>
-      <w:r>
-        <w:t xml:space="preserve"> (</w:t>
-      </w:r>
-      <w:r>
-        <w:rPr>
-          <w:rFonts w:ascii="Consolas" w:hAnsi="Consolas"/>
-          <w:color w:val="802020"/>
-        </w:rPr>
-        <w:t>memoryfunctions.py:1211</w:t>
-      </w:r>
-      <w:r>
-        <w:t xml:space="preserve">). An output port reading it is built 1 wide even with 3 stored keys, unless you set it beforehand with </w:t>
-      </w:r>
-      <w:r>
-        <w:rPr>
-          <w:rFonts w:ascii="Consolas" w:hAnsi="Consolas"/>
-          <w:color w:val="802020"/>
-        </w:rPr>
-        <w:t>override=True</w:t>
-      </w:r>
-      <w:r>
-        <w:t>.</w:t>
-      </w:r>
-    </w:p>
-    <w:p>
-      <w:pPr>
-        <w:pStyle w:val="Heading1"/>
-      </w:pPr>
-      <w:r>
         <w:t>Issues in the provided code (main.py)</w:t>
       </w:r>
     </w:p>
@@ -2451,6 +2873,82 @@
     </w:p>
     <w:p>
       <w:pPr>
+        <w:ind w:left="360" w:hanging="360"/>
+      </w:pPr>
+      <w:r>
+        <w:t>7.</w:t>
+        <w:tab/>
+      </w:r>
+      <w:r>
+        <w:rPr>
+          <w:rFonts w:ascii="Consolas" w:hAnsi="Consolas"/>
+          <w:b/>
+          <w:color w:val="802020"/>
+        </w:rPr>
+        <w:t>const_one</w:t>
+      </w:r>
+      <w:r>
+        <w:rPr>
+          <w:b/>
+        </w:rPr>
+        <w:t xml:space="preserve"> isn't a bias node</w:t>
+      </w:r>
+      <w:r>
+        <w:t xml:space="preserve"> (lines 126-128). </w:t>
+      </w:r>
+      <w:r>
+        <w:rPr>
+          <w:rFonts w:ascii="Consolas" w:hAnsi="Consolas"/>
+          <w:color w:val="802020"/>
+        </w:rPr>
+        <w:t>DEFAULT_INPUT: DEFAULT_VARIABLE</w:t>
+      </w:r>
+      <w:r>
+        <w:t xml:space="preserve"> inside a port specification dict is ignored (the port's </w:t>
+      </w:r>
+      <w:r>
+        <w:rPr>
+          <w:rFonts w:ascii="Consolas" w:hAnsi="Consolas"/>
+          <w:color w:val="802020"/>
+        </w:rPr>
+        <w:t>default_input</w:t>
+      </w:r>
+      <w:r>
+        <w:t xml:space="preserve"> is </w:t>
+      </w:r>
+      <w:r>
+        <w:rPr>
+          <w:rFonts w:ascii="Consolas" w:hAnsi="Consolas"/>
+          <w:color w:val="802020"/>
+        </w:rPr>
+        <w:t>None</w:t>
+      </w:r>
+      <w:r>
+        <w:t xml:space="preserve">), so </w:t>
+      </w:r>
+      <w:r>
+        <w:rPr>
+          <w:rFonts w:ascii="Consolas" w:hAnsi="Consolas"/>
+          <w:color w:val="802020"/>
+        </w:rPr>
+        <w:t>const_one</w:t>
+      </w:r>
+      <w:r>
+        <w:t xml:space="preserve"> is an ordinary INPUT node that expects external input. Giving the port as </w:t>
+      </w:r>
+      <w:r>
+        <w:rPr>
+          <w:rFonts w:ascii="Consolas" w:hAnsi="Consolas"/>
+          <w:color w:val="802020"/>
+        </w:rPr>
+        <w:t>InputPort(name='IN', default_input=DEFAULT_VARIABLE)</w:t>
+      </w:r>
+      <w:r>
+        <w:t xml:space="preserve"> makes it a BIAS node.</w:t>
+      </w:r>
+    </w:p>
+    <w:p>
+      <w:pPr>
         <w:pStyle w:val="Heading2"/>
       </w:pPr>
       <w:r>
@@ -2462,7 +2960,7 @@
         <w:ind w:left="360" w:hanging="360"/>
       </w:pPr>
       <w:r>
-        <w:t>7.</w:t>
+        <w:t>8.</w:t>
         <w:tab/>
       </w:r>
       <w:r>
@@ -2504,7 +3002,7 @@
         <w:ind w:left="360" w:hanging="360"/>
       </w:pPr>
       <w:r>
-        <w:t>8.</w:t>
+        <w:t>9.</w:t>
         <w:tab/>
       </w:r>
       <w:r>
@@ -2532,7 +3030,7 @@
         <w:ind w:left="360" w:hanging="360"/>
       </w:pPr>
       <w:r>
-        <w:t>9.</w:t>
+        <w:t>10.</w:t>
         <w:tab/>
       </w:r>
       <w:r>
@@ -2598,7 +3096,7 @@
         <w:ind w:left="360" w:hanging="360"/>
       </w:pPr>
       <w:r>
-        <w:t>10.</w:t>
+        <w:t>11.</w:t>
         <w:tab/>
       </w:r>
       <w:r>
@@ -2621,7 +3119,7 @@
         <w:ind w:left="360" w:hanging="360"/>
       </w:pPr>
       <w:r>
-        <w:t>11.</w:t>
+        <w:t>12.</w:t>
         <w:tab/>
       </w:r>
       <w:r>
@@ -2669,7 +3167,7 @@
         <w:ind w:left="360" w:hanging="360"/>
       </w:pPr>
       <w:r>
-        <w:t>12.</w:t>
+        <w:t>13.</w:t>
         <w:tab/>
       </w:r>
       <w:r>

</xml_diff>

<commit_message>
Report: lead with the step-by-step account of what was tried
Co-Authored-By: Claude Opus 5.5 <noreply@anthropic.com>
Claude-Session: https://claude.ai/code/session_01Pj1PPavthJ9iFe8XHJiggU
</commit_message>
<xml_diff>
--- a/pnl_issues.docx
+++ b/pnl_issues.docx
@@ -15,12 +15,12 @@
         <w:pStyle w:val="Heading1"/>
       </w:pPr>
       <w:r>
-        <w:t>Memory structures</w:t>
+        <w:t>What was tried, and why each alternative fails</w:t>
       </w:r>
     </w:p>
     <w:p>
       <w:r>
-        <w:t>This is the main reason ESBN couldn't be built in PsyNeuLink. ESBN needs two memories that start empty for each sequence, grow by one entry per step, and expose the raw query-key dot products; none of PsyNeuLink's memory structures does all of this.</w:t>
+        <w:t>This was a step-by-step procedure: each approach was built and run, and each failure led to the next workaround. Together they are why ESBN can't be built as a trainable PsyNeuLink model.</w:t>
       </w:r>
     </w:p>
     <w:p>
@@ -28,6 +28,942 @@
         <w:pStyle w:val="Heading2"/>
       </w:pPr>
       <w:r>
+        <w:t>Step 1: EMComposition</w:t>
+      </w:r>
+    </w:p>
+    <w:p>
+      <w:r>
+        <w:rPr>
+          <w:b/>
+        </w:rPr>
+        <w:t>Why it was tried first:</w:t>
+      </w:r>
+      <w:r>
+        <w:t xml:space="preserve"> it is PsyNeuLink's key-value episodic memory and the obvious high-level choice. It stores key and value fields together, has a fixed capacity (so its outputs don't grow), and supports PyTorch. This version also has </w:t>
+      </w:r>
+      <w:r>
+        <w:rPr>
+          <w:rFonts w:ascii="Consolas" w:hAnsi="Consolas"/>
+          <w:color w:val="802020"/>
+        </w:rPr>
+        <w:t>full_sequence_mode</w:t>
+      </w:r>
+      <w:r>
+        <w:t xml:space="preserve"> (a whole sequence as one trial, backpropagated through time) and </w:t>
+      </w:r>
+      <w:r>
+        <w:rPr>
+          <w:rFonts w:ascii="Consolas" w:hAnsi="Consolas"/>
+          <w:color w:val="802020"/>
+        </w:rPr>
+        <w:t>differentiable_storage</w:t>
+      </w:r>
+      <w:r>
+        <w:t xml:space="preserve"> (gradients through stored entries, which ESBN needs); the repository's tests for both pass.</w:t>
+      </w:r>
+    </w:p>
+    <w:p>
+      <w:r>
+        <w:rPr>
+          <w:b/>
+        </w:rPr>
+        <w:t>Why it fails:</w:t>
+      </w:r>
+    </w:p>
+    <w:p>
+      <w:pPr>
+        <w:ind w:left="360" w:hanging="360"/>
+      </w:pPr>
+      <w:r>
+        <w:t>1.</w:t>
+        <w:tab/>
+      </w:r>
+      <w:r>
+        <w:t>It doesn't output the raw dot products. The key field's memory node runs more than once per trial: the first run computes the raw scores (</w:t>
+      </w:r>
+      <w:r>
+        <w:rPr>
+          <w:rFonts w:ascii="Consolas" w:hAnsi="Consolas"/>
+          <w:color w:val="802020"/>
+        </w:rPr>
+        <w:t>[4, 3]</w:t>
+      </w:r>
+      <w:r>
+        <w:t xml:space="preserve">), and a later run overwrites the same </w:t>
+      </w:r>
+      <w:r>
+        <w:rPr>
+          <w:rFonts w:ascii="Consolas" w:hAnsi="Consolas"/>
+          <w:color w:val="802020"/>
+        </w:rPr>
+        <w:t>SCORES</w:t>
+      </w:r>
+      <w:r>
+        <w:t xml:space="preserve"> output with the softmaxed weights (</w:t>
+      </w:r>
+      <w:r>
+        <w:rPr>
+          <w:rFonts w:ascii="Consolas" w:hAnsi="Consolas"/>
+          <w:color w:val="802020"/>
+        </w:rPr>
+        <w:t>[0.7311, 0.2689]</w:t>
+      </w:r>
+      <w:r>
+        <w:t xml:space="preserve">). A node outside the EMComposition receives only the softmaxed values, nodes can't be added inside it, and softmax can't be inverted. ESBN's confidence gate, </w:t>
+      </w:r>
+      <w:r>
+        <w:rPr>
+          <w:rFonts w:ascii="Consolas" w:hAnsi="Consolas"/>
+          <w:color w:val="802020"/>
+        </w:rPr>
+        <w:t>σ(γ·s + β)</w:t>
+      </w:r>
+      <w:r>
+        <w:t>, needs the raw scores.</w:t>
+      </w:r>
+    </w:p>
+    <w:p>
+      <w:pPr>
+        <w:ind w:left="360" w:hanging="360"/>
+      </w:pPr>
+      <w:r>
+        <w:t>2.</w:t>
+        <w:tab/>
+      </w:r>
+      <w:r>
+        <w:t xml:space="preserve">Reading the </w:t>
+      </w:r>
+      <w:r>
+        <w:rPr>
+          <w:rFonts w:ascii="Consolas" w:hAnsi="Consolas"/>
+          <w:color w:val="802020"/>
+        </w:rPr>
+        <w:t>SCORES</w:t>
+      </w:r>
+      <w:r>
+        <w:t xml:space="preserve"> port from outside also breaks training: in an AutodiffComposition, a projection from it to an outside node makes the learning setup crash (</w:t>
+      </w:r>
+      <w:r>
+        <w:rPr>
+          <w:rFonts w:ascii="Consolas" w:hAnsi="Consolas"/>
+          <w:color w:val="802020"/>
+        </w:rPr>
+        <w:t>IndexError</w:t>
+      </w:r>
+      <w:r>
+        <w:t xml:space="preserve"> in </w:t>
+      </w:r>
+      <w:r>
+        <w:rPr>
+          <w:rFonts w:ascii="Consolas" w:hAnsi="Consolas"/>
+          <w:color w:val="802020"/>
+        </w:rPr>
+        <w:t>_add_dependency</w:t>
+      </w:r>
+      <w:r>
+        <w:t xml:space="preserve">, </w:t>
+      </w:r>
+      <w:r>
+        <w:rPr>
+          <w:rFonts w:ascii="Consolas" w:hAnsi="Consolas"/>
+          <w:color w:val="802020"/>
+        </w:rPr>
+        <w:t>autodiffcomposition.py:2384</w:t>
+      </w:r>
+      <w:r>
+        <w:t>), whether the projection is added after construction or given in the pathways.</w:t>
+      </w:r>
+    </w:p>
+    <w:p>
+      <w:pPr>
+        <w:ind w:left="360" w:hanging="360"/>
+      </w:pPr>
+      <w:r>
+        <w:t>3.</w:t>
+        <w:tab/>
+      </w:r>
+      <w:r>
+        <w:t xml:space="preserve">Storage and retrieval can't be controlled as separate steps. Every execution retrieves and then stores. </w:t>
+      </w:r>
+      <w:r>
+        <w:rPr>
+          <w:rFonts w:ascii="Consolas" w:hAnsi="Consolas"/>
+          <w:color w:val="802020"/>
+        </w:rPr>
+        <w:t>storage_prob</w:t>
+      </w:r>
+      <w:r>
+        <w:t xml:space="preserve"> only takes effect at construction: setting it to 0 afterwards (as a Parameter or as an attribute) didn't stop storage, and built with 0 it never stores.</w:t>
+      </w:r>
+    </w:p>
+    <w:p>
+      <w:pPr>
+        <w:ind w:left="360" w:hanging="360"/>
+      </w:pPr>
+      <w:r>
+        <w:t>4.</w:t>
+        <w:tab/>
+      </w:r>
+      <w:r>
+        <w:t xml:space="preserve">It can't be cleared between sequences: </w:t>
+      </w:r>
+      <w:r>
+        <w:rPr>
+          <w:rFonts w:ascii="Consolas" w:hAnsi="Consolas"/>
+          <w:color w:val="802020"/>
+        </w:rPr>
+        <w:t>reset()</w:t>
+      </w:r>
+      <w:r>
+        <w:t xml:space="preserve"> leaves the stored entries in place.</w:t>
+      </w:r>
+    </w:p>
+    <w:p>
+      <w:pPr>
+        <w:ind w:left="360" w:hanging="360"/>
+      </w:pPr>
+      <w:r>
+        <w:t>5.</w:t>
+        <w:tab/>
+      </w:r>
+      <w:r>
+        <w:t xml:space="preserve">Empty slots are filled with </w:t>
+      </w:r>
+      <w:r>
+        <w:rPr>
+          <w:rFonts w:ascii="Consolas" w:hAnsi="Consolas"/>
+          <w:color w:val="802020"/>
+        </w:rPr>
+        <w:t>memory_fill</w:t>
+      </w:r>
+      <w:r>
+        <w:t xml:space="preserve"> and take part in retrieval. With </w:t>
+      </w:r>
+      <w:r>
+        <w:rPr>
+          <w:rFonts w:ascii="Consolas" w:hAnsi="Consolas"/>
+          <w:color w:val="802020"/>
+        </w:rPr>
+        <w:t>softmax_threshold=None</w:t>
+      </w:r>
+      <w:r>
+        <w:t xml:space="preserve">, stored scores </w:t>
+      </w:r>
+      <w:r>
+        <w:rPr>
+          <w:rFonts w:ascii="Consolas" w:hAnsi="Consolas"/>
+          <w:color w:val="802020"/>
+        </w:rPr>
+        <w:t>[4, 3]</w:t>
+      </w:r>
+      <w:r>
+        <w:t xml:space="preserve"> and two empty slots, it retrieved </w:t>
+      </w:r>
+      <w:r>
+        <w:rPr>
+          <w:rFonts w:ascii="Consolas" w:hAnsi="Consolas"/>
+          <w:color w:val="802020"/>
+        </w:rPr>
+        <w:t>1.236</w:t>
+      </w:r>
+      <w:r>
+        <w:t xml:space="preserve"> instead of </w:t>
+      </w:r>
+      <w:r>
+        <w:rPr>
+          <w:rFonts w:ascii="Consolas" w:hAnsi="Consolas"/>
+          <w:color w:val="802020"/>
+        </w:rPr>
+        <w:t>1.269</w:t>
+      </w:r>
+      <w:r>
+        <w:t xml:space="preserve">. The default </w:t>
+      </w:r>
+      <w:r>
+        <w:rPr>
+          <w:rFonts w:ascii="Consolas" w:hAnsi="Consolas"/>
+          <w:color w:val="802020"/>
+        </w:rPr>
+        <w:t>softmax_threshold=.001</w:t>
+      </w:r>
+      <w:r>
+        <w:t xml:space="preserve"> masks the empty slots, but also real scores of 0: with one stored key scoring exactly 0, nothing was retrieved.</w:t>
+      </w:r>
+    </w:p>
+    <w:p>
+      <w:pPr>
+        <w:ind w:left="360" w:hanging="360"/>
+      </w:pPr>
+      <w:r>
+        <w:t>6.</w:t>
+        <w:tab/>
+      </w:r>
+      <w:r>
+        <w:t xml:space="preserve">Other defaults change retrieval: </w:t>
+      </w:r>
+      <w:r>
+        <w:rPr>
+          <w:rFonts w:ascii="Consolas" w:hAnsi="Consolas"/>
+          <w:color w:val="802020"/>
+        </w:rPr>
+        <w:t>normalize_memories=True</w:t>
+      </w:r>
+      <w:r>
+        <w:t xml:space="preserve"> gives cosine similarity instead of the dot product, and </w:t>
+      </w:r>
+      <w:r>
+        <w:rPr>
+          <w:rFonts w:ascii="Consolas" w:hAnsi="Consolas"/>
+          <w:color w:val="802020"/>
+        </w:rPr>
+        <w:t>memory_decay_rate=AUTO</w:t>
+      </w:r>
+      <w:r>
+        <w:t xml:space="preserve"> decays stored entries.</w:t>
+      </w:r>
+    </w:p>
+    <w:p>
+      <w:r>
+        <w:rPr>
+          <w:b/>
+        </w:rPr>
+        <w:t>So next:</w:t>
+      </w:r>
+      <w:r>
+        <w:t xml:space="preserve"> use the memory inside EMComposition directly, to get at the raw scores and control storage.</w:t>
+      </w:r>
+    </w:p>
+    <w:p>
+      <w:pPr>
+        <w:pStyle w:val="Heading2"/>
+      </w:pPr>
+      <w:r>
+        <w:t>Step 2: MatrixMemory (EMComposition's internal memory)</w:t>
+      </w:r>
+    </w:p>
+    <w:p>
+      <w:r>
+        <w:rPr>
+          <w:b/>
+        </w:rPr>
+        <w:t>Why it was tried:</w:t>
+      </w:r>
+      <w:r>
+        <w:t xml:space="preserve"> it is the function EMComposition uses to compute scores, retrieve and store, so using it directly would avoid EMComposition's fixed wiring.</w:t>
+      </w:r>
+    </w:p>
+    <w:p>
+      <w:r>
+        <w:rPr>
+          <w:b/>
+        </w:rPr>
+        <w:t>Why it fails:</w:t>
+      </w:r>
+      <w:r>
+        <w:t xml:space="preserve"> it can't be constructed on its own. The constructor runs the function without saying which operation to perform (compute scores, retrieve or store), and building the resulting error message crashes (</w:t>
+      </w:r>
+      <w:r>
+        <w:rPr>
+          <w:rFonts w:ascii="Consolas" w:hAnsi="Consolas"/>
+          <w:color w:val="802020"/>
+        </w:rPr>
+        <w:t>'NoneType' object has no attribute 'name'</w:t>
+      </w:r>
+      <w:r>
+        <w:t>).</w:t>
+      </w:r>
+    </w:p>
+    <w:p>
+      <w:r>
+        <w:rPr>
+          <w:b/>
+        </w:rPr>
+        <w:t>So next:</w:t>
+      </w:r>
+      <w:r>
+        <w:t xml:space="preserve"> use PsyNeuLink's general-purpose memories instead, one for the keys and one for the values.</w:t>
+      </w:r>
+    </w:p>
+    <w:p>
+      <w:pPr>
+        <w:pStyle w:val="Heading2"/>
+      </w:pPr>
+      <w:r>
+        <w:t>Step 3: ContentAddressableMemory for esbn_keys (the approach in main.py)</w:t>
+      </w:r>
+    </w:p>
+    <w:p>
+      <w:r>
+        <w:rPr>
+          <w:b/>
+        </w:rPr>
+        <w:t>Why it was tried:</w:t>
+      </w:r>
+      <w:r>
+        <w:t xml:space="preserve"> it stores every key and computes the dot product of the query with each stored key, in its </w:t>
+      </w:r>
+      <w:r>
+        <w:rPr>
+          <w:rFonts w:ascii="Consolas" w:hAnsi="Consolas"/>
+          <w:color w:val="802020"/>
+        </w:rPr>
+        <w:t>distances_to_entries</w:t>
+      </w:r>
+      <w:r>
+        <w:t xml:space="preserve"> Parameter (dot-product metric). This part works in Python mode.</w:t>
+      </w:r>
+    </w:p>
+    <w:p>
+      <w:r>
+        <w:rPr>
+          <w:b/>
+        </w:rPr>
+        <w:t>Why it fails:</w:t>
+      </w:r>
+    </w:p>
+    <w:p>
+      <w:pPr>
+        <w:ind w:left="360" w:hanging="360"/>
+      </w:pPr>
+      <w:r>
+        <w:t>1.</w:t>
+        <w:tab/>
+      </w:r>
+      <w:r>
+        <w:t>The number of dot products grows by one per stored key, but edges have fixed sizes: a growing output crashes on the next trial (</w:t>
+      </w:r>
+      <w:r>
+        <w:rPr>
+          <w:rFonts w:ascii="Consolas" w:hAnsi="Consolas"/>
+          <w:color w:val="802020"/>
+        </w:rPr>
+        <w:t>shapes (2,) and (1,1) not aligned</w:t>
+      </w:r>
+      <w:r>
+        <w:t xml:space="preserve">). So a custom numpy function on the output port has to pad the dot products to </w:t>
+      </w:r>
+      <w:r>
+        <w:rPr>
+          <w:rFonts w:ascii="Consolas" w:hAnsi="Consolas"/>
+          <w:color w:val="802020"/>
+        </w:rPr>
+        <w:t>N_STIMULI</w:t>
+      </w:r>
+      <w:r>
+        <w:t>.</w:t>
+      </w:r>
+    </w:p>
+    <w:p>
+      <w:pPr>
+        <w:ind w:left="360" w:hanging="360"/>
+      </w:pPr>
+      <w:r>
+        <w:t>2.</w:t>
+        <w:tab/>
+      </w:r>
+      <w:r>
+        <w:t xml:space="preserve">It can't start empty: built without an initializer, its </w:t>
+      </w:r>
+      <w:r>
+        <w:rPr>
+          <w:rFonts w:ascii="Consolas" w:hAnsi="Consolas"/>
+          <w:color w:val="802020"/>
+        </w:rPr>
+        <w:t>reset()</w:t>
+      </w:r>
+      <w:r>
+        <w:t xml:space="preserve"> crashes, and an empty memory reports </w:t>
+      </w:r>
+      <w:r>
+        <w:rPr>
+          <w:rFonts w:ascii="Consolas" w:hAnsi="Consolas"/>
+          <w:color w:val="802020"/>
+        </w:rPr>
+        <w:t>[0]</w:t>
+      </w:r>
+      <w:r>
+        <w:t xml:space="preserve"> as its scores. So it starts with a placeholder key, whose score the padding function drops by position.</w:t>
+      </w:r>
+    </w:p>
+    <w:p>
+      <w:pPr>
+        <w:ind w:left="360" w:hanging="360"/>
+      </w:pPr>
+      <w:r>
+        <w:t>3.</w:t>
+        <w:tab/>
+      </w:r>
+      <w:r>
+        <w:t xml:space="preserve">It can't hold the values as well: weighted retrieval over key-value pairs only works with </w:t>
+      </w:r>
+      <w:r>
+        <w:rPr>
+          <w:rFonts w:ascii="Consolas" w:hAnsi="Consolas"/>
+          <w:color w:val="802020"/>
+        </w:rPr>
+        <w:t>duplicate_entries_allowed=False</w:t>
+      </w:r>
+      <w:r>
+        <w:t>, which doesn't store repeated entries. So the values need a second memory (step 4).</w:t>
+      </w:r>
+    </w:p>
+    <w:p>
+      <w:pPr>
+        <w:ind w:left="360" w:hanging="360"/>
+      </w:pPr>
+      <w:r>
+        <w:t>4.</w:t>
+        <w:tab/>
+      </w:r>
+      <w:r>
+        <w:t xml:space="preserve">It can't be trained: </w:t>
+      </w:r>
+      <w:r>
+        <w:rPr>
+          <w:rFonts w:ascii="Consolas" w:hAnsi="Consolas"/>
+          <w:color w:val="802020"/>
+        </w:rPr>
+        <w:t>learn()</w:t>
+      </w:r>
+      <w:r>
+        <w:t xml:space="preserve"> rejects it (</w:t>
+      </w:r>
+      <w:r>
+        <w:rPr>
+          <w:rFonts w:ascii="Consolas" w:hAnsi="Consolas"/>
+          <w:color w:val="802020"/>
+        </w:rPr>
+        <w:t>… is not currently supported by AutodiffComposition</w:t>
+      </w:r>
+      <w:r>
+        <w:t xml:space="preserve">), and the padding function would also need a </w:t>
+      </w:r>
+      <w:r>
+        <w:rPr>
+          <w:rFonts w:ascii="Consolas" w:hAnsi="Consolas"/>
+          <w:color w:val="802020"/>
+        </w:rPr>
+        <w:t>pytorch_function_generator</w:t>
+      </w:r>
+      <w:r>
+        <w:t>. The model runs forward, but backpropagation isn't possible.</w:t>
+      </w:r>
+    </w:p>
+    <w:p>
+      <w:pPr>
+        <w:pStyle w:val="Heading2"/>
+      </w:pPr>
+      <w:r>
+        <w:t>Step 4: Buffer for esbn_vals</w:t>
+      </w:r>
+    </w:p>
+    <w:p>
+      <w:r>
+        <w:rPr>
+          <w:b/>
+        </w:rPr>
+        <w:t>Why it was tried:</w:t>
+      </w:r>
+      <w:r>
+        <w:t xml:space="preserve"> it accumulates one entry per trial, which is what </w:t>
+      </w:r>
+      <w:r>
+        <w:rPr>
+          <w:rFonts w:ascii="Consolas" w:hAnsi="Consolas"/>
+          <w:color w:val="802020"/>
+        </w:rPr>
+        <w:t>esbn_vals</w:t>
+      </w:r>
+      <w:r>
+        <w:t xml:space="preserve"> needs.</w:t>
+      </w:r>
+    </w:p>
+    <w:p>
+      <w:r>
+        <w:rPr>
+          <w:b/>
+        </w:rPr>
+        <w:t>Why it fails:</w:t>
+      </w:r>
+    </w:p>
+    <w:p>
+      <w:pPr>
+        <w:ind w:left="360" w:hanging="360"/>
+      </w:pPr>
+      <w:r>
+        <w:t>1.</w:t>
+        <w:tab/>
+      </w:r>
+      <w:r>
+        <w:t>The same fixed-size edge problem applies, and its default output port passes on only its first stored item, so the stored values also have to be padded by a custom function on an output port.</w:t>
+      </w:r>
+    </w:p>
+    <w:p>
+      <w:pPr>
+        <w:ind w:left="360" w:hanging="360"/>
+      </w:pPr>
+      <w:r>
+        <w:t>2.</w:t>
+        <w:tab/>
+      </w:r>
+      <w:r>
+        <w:t xml:space="preserve">It can't start empty with vector entries, the placeholder is never dropped, and </w:t>
+      </w:r>
+      <w:r>
+        <w:rPr>
+          <w:rFonts w:ascii="Consolas" w:hAnsi="Consolas"/>
+          <w:color w:val="802020"/>
+        </w:rPr>
+        <w:t>reset()</w:t>
+      </w:r>
+      <w:r>
+        <w:t xml:space="preserve"> restores it (only </w:t>
+      </w:r>
+      <w:r>
+        <w:rPr>
+          <w:rFonts w:ascii="Consolas" w:hAnsi="Consolas"/>
+          <w:color w:val="802020"/>
+        </w:rPr>
+        <w:t>reset([])</w:t>
+      </w:r>
+      <w:r>
+        <w:t xml:space="preserve"> empties it).</w:t>
+      </w:r>
+    </w:p>
+    <w:p>
+      <w:pPr>
+        <w:ind w:left="360" w:hanging="360"/>
+      </w:pPr>
+      <w:r>
+        <w:t>3.</w:t>
+        <w:tab/>
+      </w:r>
+      <w:r>
+        <w:rPr>
+          <w:rFonts w:ascii="Consolas" w:hAnsi="Consolas"/>
+          <w:color w:val="802020"/>
+        </w:rPr>
+        <w:t>learn()</w:t>
+      </w:r>
+      <w:r>
+        <w:t xml:space="preserve"> rejects it, for the same reason as </w:t>
+      </w:r>
+      <w:r>
+        <w:rPr>
+          <w:rFonts w:ascii="Consolas" w:hAnsi="Consolas"/>
+          <w:color w:val="802020"/>
+        </w:rPr>
+        <w:t>ContentAddressableMemory</w:t>
+      </w:r>
+      <w:r>
+        <w:t>.</w:t>
+      </w:r>
+    </w:p>
+    <w:p>
+      <w:r>
+        <w:rPr>
+          <w:b/>
+        </w:rPr>
+        <w:t>So next:</w:t>
+      </w:r>
+      <w:r>
+        <w:t xml:space="preserve"> since no PsyNeuLink memory can be trained, write the memories as custom PyTorch functions inside the PsyNeuLink model.</w:t>
+      </w:r>
+    </w:p>
+    <w:p>
+      <w:pPr>
+        <w:pStyle w:val="Heading2"/>
+      </w:pPr>
+      <w:r>
+        <w:t>Step 5: Custom PyTorch memory inside PsyNeuLink</w:t>
+      </w:r>
+    </w:p>
+    <w:p>
+      <w:r>
+        <w:rPr>
+          <w:b/>
+        </w:rPr>
+        <w:t>Why it was tried:</w:t>
+      </w:r>
+      <w:r>
+        <w:t xml:space="preserve"> a </w:t>
+      </w:r>
+      <w:r>
+        <w:rPr>
+          <w:rFonts w:ascii="Consolas" w:hAnsi="Consolas"/>
+          <w:color w:val="802020"/>
+        </w:rPr>
+        <w:t>UserDefinedFunction</w:t>
+      </w:r>
+      <w:r>
+        <w:t xml:space="preserve"> with a </w:t>
+      </w:r>
+      <w:r>
+        <w:rPr>
+          <w:rFonts w:ascii="Consolas" w:hAnsi="Consolas"/>
+          <w:color w:val="802020"/>
+        </w:rPr>
+        <w:t>pytorch_function_generator</w:t>
+      </w:r>
+      <w:r>
+        <w:t xml:space="preserve"> is accepted by </w:t>
+      </w:r>
+      <w:r>
+        <w:rPr>
+          <w:rFonts w:ascii="Consolas" w:hAnsi="Consolas"/>
+          <w:color w:val="802020"/>
+        </w:rPr>
+        <w:t>learn()</w:t>
+      </w:r>
+      <w:r>
+        <w:t xml:space="preserve">. The memories were written as such functions, with the stored entries carried from step to step by feedback projections, and each sequence run as one trial in </w:t>
+      </w:r>
+      <w:r>
+        <w:rPr>
+          <w:rFonts w:ascii="Consolas" w:hAnsi="Consolas"/>
+          <w:color w:val="802020"/>
+        </w:rPr>
+        <w:t>full_sequence_mode</w:t>
+      </w:r>
+      <w:r>
+        <w:t>. A loop through a second node does carry values across steps, and backpropagation through it gave the correct gradients on a small example.</w:t>
+      </w:r>
+    </w:p>
+    <w:p>
+      <w:r>
+        <w:rPr>
+          <w:b/>
+        </w:rPr>
+        <w:t>Why it fails:</w:t>
+      </w:r>
+      <w:r>
+        <w:t xml:space="preserve"> getting the full model to train needed these workarounds, each found by running it:</w:t>
+      </w:r>
+    </w:p>
+    <w:p>
+      <w:pPr>
+        <w:ind w:left="360" w:hanging="360"/>
+      </w:pPr>
+      <w:r>
+        <w:t>1.</w:t>
+        <w:tab/>
+      </w:r>
+      <w:r>
+        <w:t>A projection from a node to itself is dropped in PyTorch mode (nothing accumulated), so each memory loops through a second "delay" node.</w:t>
+      </w:r>
+    </w:p>
+    <w:p>
+      <w:pPr>
+        <w:ind w:left="360" w:hanging="360"/>
+      </w:pPr>
+      <w:r>
+        <w:t>2.</w:t>
+        <w:tab/>
+      </w:r>
+      <w:r>
+        <w:rPr>
+          <w:rFonts w:ascii="Consolas" w:hAnsi="Consolas"/>
+          <w:color w:val="802020"/>
+        </w:rPr>
+        <w:t>add_projection(..., feedback=True)</w:t>
+      </w:r>
+      <w:r>
+        <w:t xml:space="preserve"> isn't enough for learning: the learning setup reports a cycle unless the projection itself is constructed with </w:t>
+      </w:r>
+      <w:r>
+        <w:rPr>
+          <w:rFonts w:ascii="Consolas" w:hAnsi="Consolas"/>
+          <w:color w:val="802020"/>
+        </w:rPr>
+        <w:t>feedback=True</w:t>
+      </w:r>
+      <w:r>
+        <w:t>.</w:t>
+      </w:r>
+    </w:p>
+    <w:p>
+      <w:pPr>
+        <w:ind w:left="360" w:hanging="360"/>
+      </w:pPr>
+      <w:r>
+        <w:t>3.</w:t>
+        <w:tab/>
+      </w:r>
+      <w:r>
+        <w:t xml:space="preserve">A feedback projection into the nested </w:t>
+      </w:r>
+      <w:r>
+        <w:rPr>
+          <w:rFonts w:ascii="Consolas" w:hAnsi="Consolas"/>
+          <w:color w:val="802020"/>
+        </w:rPr>
+        <w:t>GRUComposition</w:t>
+      </w:r>
+      <w:r>
+        <w:t xml:space="preserve"> fails either way: constructed with </w:t>
+      </w:r>
+      <w:r>
+        <w:rPr>
+          <w:rFonts w:ascii="Consolas" w:hAnsi="Consolas"/>
+          <w:color w:val="802020"/>
+        </w:rPr>
+        <w:t>feedback=True</w:t>
+      </w:r>
+      <w:r>
+        <w:t xml:space="preserve"> it raises a </w:t>
+      </w:r>
+      <w:r>
+        <w:rPr>
+          <w:rFonts w:ascii="Consolas" w:hAnsi="Consolas"/>
+          <w:color w:val="802020"/>
+        </w:rPr>
+        <w:t>KeyError</w:t>
+      </w:r>
+      <w:r>
+        <w:t>, and without it the learning setup reports a cycle. So the feedback has to end at a plain node in front of the GRU.</w:t>
+      </w:r>
+    </w:p>
+    <w:p>
+      <w:pPr>
+        <w:ind w:left="360" w:hanging="360"/>
+      </w:pPr>
+      <w:r>
+        <w:t>4.</w:t>
+        <w:tab/>
+      </w:r>
+      <w:r>
+        <w:t>Before a feedback projection's sender has run, the projection sends a default the size of its receiver through its matrix, which crashes unless the matrix is square.</w:t>
+      </w:r>
+    </w:p>
+    <w:p>
+      <w:pPr>
+        <w:ind w:left="360" w:hanging="360"/>
+      </w:pPr>
+      <w:r>
+        <w:t>5.</w:t>
+        <w:tab/>
+      </w:r>
+      <w:r>
+        <w:rPr>
+          <w:rFonts w:ascii="Consolas" w:hAnsi="Consolas"/>
+          <w:color w:val="802020"/>
+        </w:rPr>
+        <w:t>DEFAULT_INPUT: DEFAULT_VARIABLE</w:t>
+      </w:r>
+      <w:r>
+        <w:t xml:space="preserve"> in a port specification dict is ignored, so </w:t>
+      </w:r>
+      <w:r>
+        <w:rPr>
+          <w:rFonts w:ascii="Consolas" w:hAnsi="Consolas"/>
+          <w:color w:val="802020"/>
+        </w:rPr>
+        <w:t>const_one</w:t>
+      </w:r>
+      <w:r>
+        <w:t xml:space="preserve"> is an ordinary INPUT node rather than a BIAS node; it has to be given as an </w:t>
+      </w:r>
+      <w:r>
+        <w:rPr>
+          <w:rFonts w:ascii="Consolas" w:hAnsi="Consolas"/>
+          <w:color w:val="802020"/>
+        </w:rPr>
+        <w:t>InputPort</w:t>
+      </w:r>
+      <w:r>
+        <w:t xml:space="preserve"> object.</w:t>
+      </w:r>
+    </w:p>
+    <w:p>
+      <w:pPr>
+        <w:ind w:left="360" w:hanging="360"/>
+      </w:pPr>
+      <w:r>
+        <w:t>6.</w:t>
+        <w:tab/>
+      </w:r>
+      <w:r>
+        <w:t>The memory carried over from the previous minibatch keeps its autograd graph, so the next backward pass fails (</w:t>
+      </w:r>
+      <w:r>
+        <w:rPr>
+          <w:rFonts w:ascii="Consolas" w:hAnsi="Consolas"/>
+          <w:color w:val="802020"/>
+        </w:rPr>
+        <w:t>one of the variables needed for gradient computation has been modified by an inplace operation</w:t>
+      </w:r>
+      <w:r>
+        <w:t>). The memories have to be replaced with new zero tensors at the end of each sequence.</w:t>
+      </w:r>
+    </w:p>
+    <w:p>
+      <w:pPr>
+        <w:ind w:left="360" w:hanging="360"/>
+      </w:pPr>
+      <w:r>
+        <w:t>7.</w:t>
+        <w:tab/>
+      </w:r>
+      <w:r>
+        <w:t>Copying the GRU's node values back from PyTorch fails for minibatches of more than one sequence (a shape-mismatch assertion), so node-value copying has to be turned off.</w:t>
+      </w:r>
+    </w:p>
+    <w:p>
+      <w:pPr>
+        <w:ind w:left="360" w:hanging="360"/>
+      </w:pPr>
+      <w:r>
+        <w:t>8.</w:t>
+        <w:tab/>
+      </w:r>
+      <w:r>
+        <w:t xml:space="preserve">Testing with </w:t>
+      </w:r>
+      <w:r>
+        <w:rPr>
+          <w:rFonts w:ascii="Consolas" w:hAnsi="Consolas"/>
+          <w:color w:val="802020"/>
+        </w:rPr>
+        <w:t>learn(learning_rate=0)</w:t>
+      </w:r>
+      <w:r>
+        <w:t xml:space="preserve"> doesn't revert: later training no longer changed the weights.</w:t>
+      </w:r>
+    </w:p>
+    <w:p>
+      <w:r>
+        <w:t>With these, the model trains (32 sequences in about 6 seconds), but it hasn't been checked against the plain-PyTorch version. And at this point the memory is PyTorch code inside custom functions: PsyNeuLink only provides the wiring, so it is no longer a PsyNeuLink memory.</w:t>
+      </w:r>
+    </w:p>
+    <w:p>
+      <w:r>
+        <w:rPr>
+          <w:b/>
+        </w:rPr>
+        <w:t>Result:</w:t>
+      </w:r>
+      <w:r>
+        <w:t xml:space="preserve"> the plain-PyTorch ESBN, with the memory as ordinary Python lists, reached 100% accuracy on objects it never saw in training in one run (88% in another, from a different random start).</w:t>
+      </w:r>
+    </w:p>
+    <w:p>
+      <w:pPr>
+        <w:pStyle w:val="Heading1"/>
+      </w:pPr>
+      <w:r>
+        <w:t>Memory structures</w:t>
+      </w:r>
+    </w:p>
+    <w:p>
+      <w:r>
+        <w:t>This is the main reason ESBN couldn't be built in PsyNeuLink. ESBN needs two memories that start empty for each sequence, grow by one entry per step, and expose the raw query-key dot products; none of PsyNeuLink's memory structures does all of this.</w:t>
+      </w:r>
+    </w:p>
+    <w:p>
+      <w:pPr>
+        <w:pStyle w:val="Heading2"/>
+      </w:pPr>
+      <w:r>
         <w:t>Key-value memory is limited</w:t>
       </w:r>
     </w:p>
@@ -466,833 +1402,6 @@
       </w:pPr>
       <w:r>
         <w:t>Proposal: allow empty memories (an empty initializer with a declared entry shape), or a designated placeholder that's dropped on the first write. Also expose the number of stored entries, or a mask of filled slots, so padding and masking downstream don't depend on these conventions.</w:t>
-      </w:r>
-    </w:p>
-    <w:p>
-      <w:pPr>
-        <w:pStyle w:val="Heading1"/>
-      </w:pPr>
-      <w:r>
-        <w:t>What was tried, and why each alternative fails</w:t>
-      </w:r>
-    </w:p>
-    <w:p>
-      <w:r>
-        <w:t>Each approach below was built and run. Together they are why ESBN can't be built as a trainable PsyNeuLink model.</w:t>
-      </w:r>
-    </w:p>
-    <w:p>
-      <w:pPr>
-        <w:pStyle w:val="Heading2"/>
-      </w:pPr>
-      <w:r>
-        <w:t>1. ContentAddressableMemory (the approach in main.py)</w:t>
-      </w:r>
-    </w:p>
-    <w:p>
-      <w:pPr>
-        <w:ind w:left="360" w:hanging="360"/>
-      </w:pPr>
-      <w:r>
-        <w:t>1.</w:t>
-        <w:tab/>
-      </w:r>
-      <w:r>
-        <w:t xml:space="preserve">Each embedding is stored as a key, and the dot products with every stored key are read from its </w:t>
-      </w:r>
-      <w:r>
-        <w:rPr>
-          <w:rFonts w:ascii="Consolas" w:hAnsi="Consolas"/>
-          <w:color w:val="802020"/>
-        </w:rPr>
-        <w:t>distances_to_entries</w:t>
-      </w:r>
-      <w:r>
-        <w:t xml:space="preserve"> Parameter (dot-product metric). This part works in Python mode.</w:t>
-      </w:r>
-    </w:p>
-    <w:p>
-      <w:pPr>
-        <w:ind w:left="360" w:hanging="360"/>
-      </w:pPr>
-      <w:r>
-        <w:t>2.</w:t>
-        <w:tab/>
-      </w:r>
-      <w:r>
-        <w:t>The number of dot products grows by one per stored key, but edges have fixed sizes: a growing output crashes on the next trial (</w:t>
-      </w:r>
-      <w:r>
-        <w:rPr>
-          <w:rFonts w:ascii="Consolas" w:hAnsi="Consolas"/>
-          <w:color w:val="802020"/>
-        </w:rPr>
-        <w:t>shapes (2,) and (1,1) not aligned</w:t>
-      </w:r>
-      <w:r>
-        <w:t xml:space="preserve">). So a custom numpy function on the output port has to pad the dot products to </w:t>
-      </w:r>
-      <w:r>
-        <w:rPr>
-          <w:rFonts w:ascii="Consolas" w:hAnsi="Consolas"/>
-          <w:color w:val="802020"/>
-        </w:rPr>
-        <w:t>N_STIMULI</w:t>
-      </w:r>
-      <w:r>
-        <w:t>.</w:t>
-      </w:r>
-    </w:p>
-    <w:p>
-      <w:pPr>
-        <w:ind w:left="360" w:hanging="360"/>
-      </w:pPr>
-      <w:r>
-        <w:t>3.</w:t>
-        <w:tab/>
-      </w:r>
-      <w:r>
-        <w:t xml:space="preserve">It can't start empty: built without an initializer, its </w:t>
-      </w:r>
-      <w:r>
-        <w:rPr>
-          <w:rFonts w:ascii="Consolas" w:hAnsi="Consolas"/>
-          <w:color w:val="802020"/>
-        </w:rPr>
-        <w:t>reset()</w:t>
-      </w:r>
-      <w:r>
-        <w:t xml:space="preserve"> crashes, and an empty memory reports </w:t>
-      </w:r>
-      <w:r>
-        <w:rPr>
-          <w:rFonts w:ascii="Consolas" w:hAnsi="Consolas"/>
-          <w:color w:val="802020"/>
-        </w:rPr>
-        <w:t>[0]</w:t>
-      </w:r>
-      <w:r>
-        <w:t xml:space="preserve"> as its scores. So it starts with a placeholder key, whose score the padding function drops by position.</w:t>
-      </w:r>
-    </w:p>
-    <w:p>
-      <w:pPr>
-        <w:ind w:left="360" w:hanging="360"/>
-      </w:pPr>
-      <w:r>
-        <w:t>4.</w:t>
-        <w:tab/>
-      </w:r>
-      <w:r>
-        <w:t xml:space="preserve">It can't hold the values as well: weighted retrieval over key-value pairs only works with </w:t>
-      </w:r>
-      <w:r>
-        <w:rPr>
-          <w:rFonts w:ascii="Consolas" w:hAnsi="Consolas"/>
-          <w:color w:val="802020"/>
-        </w:rPr>
-        <w:t>duplicate_entries_allowed=False</w:t>
-      </w:r>
-      <w:r>
-        <w:t>, which doesn't store repeated entries. So the values need a second memory.</w:t>
-      </w:r>
-    </w:p>
-    <w:p>
-      <w:pPr>
-        <w:ind w:left="360" w:hanging="360"/>
-      </w:pPr>
-      <w:r>
-        <w:t>5.</w:t>
-        <w:tab/>
-      </w:r>
-      <w:r>
-        <w:t xml:space="preserve">It can't be trained: </w:t>
-      </w:r>
-      <w:r>
-        <w:rPr>
-          <w:rFonts w:ascii="Consolas" w:hAnsi="Consolas"/>
-          <w:color w:val="802020"/>
-        </w:rPr>
-        <w:t>learn()</w:t>
-      </w:r>
-      <w:r>
-        <w:t xml:space="preserve"> rejects it (</w:t>
-      </w:r>
-      <w:r>
-        <w:rPr>
-          <w:rFonts w:ascii="Consolas" w:hAnsi="Consolas"/>
-          <w:color w:val="802020"/>
-        </w:rPr>
-        <w:t>… is not currently supported by AutodiffComposition</w:t>
-      </w:r>
-      <w:r>
-        <w:t xml:space="preserve">), and the padding function would also need a </w:t>
-      </w:r>
-      <w:r>
-        <w:rPr>
-          <w:rFonts w:ascii="Consolas" w:hAnsi="Consolas"/>
-          <w:color w:val="802020"/>
-        </w:rPr>
-        <w:t>pytorch_function_generator</w:t>
-      </w:r>
-      <w:r>
-        <w:t>. This is the dead end: the model runs forward, but backpropagation isn't possible.</w:t>
-      </w:r>
-    </w:p>
-    <w:p>
-      <w:pPr>
-        <w:pStyle w:val="Heading2"/>
-      </w:pPr>
-      <w:r>
-        <w:t>2. Buffer (for esbn_vals)</w:t>
-      </w:r>
-    </w:p>
-    <w:p>
-      <w:pPr>
-        <w:ind w:left="360" w:hanging="360"/>
-      </w:pPr>
-      <w:r>
-        <w:t>1.</w:t>
-        <w:tab/>
-      </w:r>
-      <w:r>
-        <w:t xml:space="preserve">It accumulates one entry per trial, which is what </w:t>
-      </w:r>
-      <w:r>
-        <w:rPr>
-          <w:rFonts w:ascii="Consolas" w:hAnsi="Consolas"/>
-          <w:color w:val="802020"/>
-        </w:rPr>
-        <w:t>esbn_vals</w:t>
-      </w:r>
-      <w:r>
-        <w:t xml:space="preserve"> needs.</w:t>
-      </w:r>
-    </w:p>
-    <w:p>
-      <w:pPr>
-        <w:ind w:left="360" w:hanging="360"/>
-      </w:pPr>
-      <w:r>
-        <w:t>2.</w:t>
-        <w:tab/>
-      </w:r>
-      <w:r>
-        <w:t>The same fixed-size edge problem applies, and its default output port passes on only its first stored item, so the stored values also have to be padded by a custom function on an output port.</w:t>
-      </w:r>
-    </w:p>
-    <w:p>
-      <w:pPr>
-        <w:ind w:left="360" w:hanging="360"/>
-      </w:pPr>
-      <w:r>
-        <w:t>3.</w:t>
-        <w:tab/>
-      </w:r>
-      <w:r>
-        <w:t xml:space="preserve">It can't start empty with vector entries, the placeholder is never dropped, and </w:t>
-      </w:r>
-      <w:r>
-        <w:rPr>
-          <w:rFonts w:ascii="Consolas" w:hAnsi="Consolas"/>
-          <w:color w:val="802020"/>
-        </w:rPr>
-        <w:t>reset()</w:t>
-      </w:r>
-      <w:r>
-        <w:t xml:space="preserve"> restores it (only </w:t>
-      </w:r>
-      <w:r>
-        <w:rPr>
-          <w:rFonts w:ascii="Consolas" w:hAnsi="Consolas"/>
-          <w:color w:val="802020"/>
-        </w:rPr>
-        <w:t>reset([])</w:t>
-      </w:r>
-      <w:r>
-        <w:t xml:space="preserve"> empties it).</w:t>
-      </w:r>
-    </w:p>
-    <w:p>
-      <w:pPr>
-        <w:ind w:left="360" w:hanging="360"/>
-      </w:pPr>
-      <w:r>
-        <w:t>4.</w:t>
-        <w:tab/>
-      </w:r>
-      <w:r>
-        <w:rPr>
-          <w:rFonts w:ascii="Consolas" w:hAnsi="Consolas"/>
-          <w:color w:val="802020"/>
-        </w:rPr>
-        <w:t>learn()</w:t>
-      </w:r>
-      <w:r>
-        <w:t xml:space="preserve"> rejects it, for the same reason as </w:t>
-      </w:r>
-      <w:r>
-        <w:rPr>
-          <w:rFonts w:ascii="Consolas" w:hAnsi="Consolas"/>
-          <w:color w:val="802020"/>
-        </w:rPr>
-        <w:t>ContentAddressableMemory</w:t>
-      </w:r>
-      <w:r>
-        <w:t>.</w:t>
-      </w:r>
-    </w:p>
-    <w:p>
-      <w:pPr>
-        <w:pStyle w:val="Heading2"/>
-      </w:pPr>
-      <w:r>
-        <w:t>3. EMComposition</w:t>
-      </w:r>
-    </w:p>
-    <w:p>
-      <w:r>
-        <w:t xml:space="preserve">It solves the problems above: key and value fields in one memory, a fixed capacity (so no growing outputs), and PyTorch support. This version also has </w:t>
-      </w:r>
-      <w:r>
-        <w:rPr>
-          <w:rFonts w:ascii="Consolas" w:hAnsi="Consolas"/>
-          <w:color w:val="802020"/>
-        </w:rPr>
-        <w:t>full_sequence_mode</w:t>
-      </w:r>
-      <w:r>
-        <w:t xml:space="preserve"> (a whole sequence as one trial, backpropagated through time) and </w:t>
-      </w:r>
-      <w:r>
-        <w:rPr>
-          <w:rFonts w:ascii="Consolas" w:hAnsi="Consolas"/>
-          <w:color w:val="802020"/>
-        </w:rPr>
-        <w:t>differentiable_storage</w:t>
-      </w:r>
-      <w:r>
-        <w:t xml:space="preserve"> (gradients through stored entries, which ESBN needs); the repository's tests for both pass. It still fails for ESBN:</w:t>
-      </w:r>
-    </w:p>
-    <w:p>
-      <w:pPr>
-        <w:ind w:left="360" w:hanging="360"/>
-      </w:pPr>
-      <w:r>
-        <w:t>1.</w:t>
-        <w:tab/>
-      </w:r>
-      <w:r>
-        <w:t>It doesn't output the raw dot products. The key field's memory node runs more than once per trial: the first run computes the raw scores (</w:t>
-      </w:r>
-      <w:r>
-        <w:rPr>
-          <w:rFonts w:ascii="Consolas" w:hAnsi="Consolas"/>
-          <w:color w:val="802020"/>
-        </w:rPr>
-        <w:t>[4, 3]</w:t>
-      </w:r>
-      <w:r>
-        <w:t xml:space="preserve">), and a later run overwrites the same </w:t>
-      </w:r>
-      <w:r>
-        <w:rPr>
-          <w:rFonts w:ascii="Consolas" w:hAnsi="Consolas"/>
-          <w:color w:val="802020"/>
-        </w:rPr>
-        <w:t>SCORES</w:t>
-      </w:r>
-      <w:r>
-        <w:t xml:space="preserve"> output with the softmaxed weights (</w:t>
-      </w:r>
-      <w:r>
-        <w:rPr>
-          <w:rFonts w:ascii="Consolas" w:hAnsi="Consolas"/>
-          <w:color w:val="802020"/>
-        </w:rPr>
-        <w:t>[0.7311, 0.2689]</w:t>
-      </w:r>
-      <w:r>
-        <w:t xml:space="preserve">). A node outside the EMComposition receives only the softmaxed values, nodes can't be added inside it, and softmax can't be inverted. ESBN's confidence gate, </w:t>
-      </w:r>
-      <w:r>
-        <w:rPr>
-          <w:rFonts w:ascii="Consolas" w:hAnsi="Consolas"/>
-          <w:color w:val="802020"/>
-        </w:rPr>
-        <w:t>σ(γ·s + β)</w:t>
-      </w:r>
-      <w:r>
-        <w:t>, needs the raw scores.</w:t>
-      </w:r>
-    </w:p>
-    <w:p>
-      <w:pPr>
-        <w:ind w:left="360" w:hanging="360"/>
-      </w:pPr>
-      <w:r>
-        <w:t>2.</w:t>
-        <w:tab/>
-      </w:r>
-      <w:r>
-        <w:t xml:space="preserve">Reading the </w:t>
-      </w:r>
-      <w:r>
-        <w:rPr>
-          <w:rFonts w:ascii="Consolas" w:hAnsi="Consolas"/>
-          <w:color w:val="802020"/>
-        </w:rPr>
-        <w:t>SCORES</w:t>
-      </w:r>
-      <w:r>
-        <w:t xml:space="preserve"> port from outside also breaks training: in an AutodiffComposition, a projection from it to an outside node makes the learning setup crash (</w:t>
-      </w:r>
-      <w:r>
-        <w:rPr>
-          <w:rFonts w:ascii="Consolas" w:hAnsi="Consolas"/>
-          <w:color w:val="802020"/>
-        </w:rPr>
-        <w:t>IndexError</w:t>
-      </w:r>
-      <w:r>
-        <w:t xml:space="preserve"> in </w:t>
-      </w:r>
-      <w:r>
-        <w:rPr>
-          <w:rFonts w:ascii="Consolas" w:hAnsi="Consolas"/>
-          <w:color w:val="802020"/>
-        </w:rPr>
-        <w:t>_add_dependency</w:t>
-      </w:r>
-      <w:r>
-        <w:t xml:space="preserve">, </w:t>
-      </w:r>
-      <w:r>
-        <w:rPr>
-          <w:rFonts w:ascii="Consolas" w:hAnsi="Consolas"/>
-          <w:color w:val="802020"/>
-        </w:rPr>
-        <w:t>autodiffcomposition.py:2384</w:t>
-      </w:r>
-      <w:r>
-        <w:t>), whether the projection is added after construction or given in the pathways.</w:t>
-      </w:r>
-    </w:p>
-    <w:p>
-      <w:pPr>
-        <w:ind w:left="360" w:hanging="360"/>
-      </w:pPr>
-      <w:r>
-        <w:t>3.</w:t>
-        <w:tab/>
-      </w:r>
-      <w:r>
-        <w:t xml:space="preserve">Storage and retrieval can't be controlled separately. Every execution retrieves and then stores. </w:t>
-      </w:r>
-      <w:r>
-        <w:rPr>
-          <w:rFonts w:ascii="Consolas" w:hAnsi="Consolas"/>
-          <w:color w:val="802020"/>
-        </w:rPr>
-        <w:t>storage_prob</w:t>
-      </w:r>
-      <w:r>
-        <w:t xml:space="preserve"> only takes effect at construction: setting it to 0 afterwards (as a Parameter or as an attribute) didn't stop storage, and built with 0 it never stores.</w:t>
-      </w:r>
-    </w:p>
-    <w:p>
-      <w:pPr>
-        <w:ind w:left="360" w:hanging="360"/>
-      </w:pPr>
-      <w:r>
-        <w:t>4.</w:t>
-        <w:tab/>
-      </w:r>
-      <w:r>
-        <w:t xml:space="preserve">It can't be cleared between sequences: </w:t>
-      </w:r>
-      <w:r>
-        <w:rPr>
-          <w:rFonts w:ascii="Consolas" w:hAnsi="Consolas"/>
-          <w:color w:val="802020"/>
-        </w:rPr>
-        <w:t>reset()</w:t>
-      </w:r>
-      <w:r>
-        <w:t xml:space="preserve"> leaves the stored entries in place.</w:t>
-      </w:r>
-    </w:p>
-    <w:p>
-      <w:pPr>
-        <w:ind w:left="360" w:hanging="360"/>
-      </w:pPr>
-      <w:r>
-        <w:t>5.</w:t>
-        <w:tab/>
-      </w:r>
-      <w:r>
-        <w:t xml:space="preserve">Empty slots are filled with </w:t>
-      </w:r>
-      <w:r>
-        <w:rPr>
-          <w:rFonts w:ascii="Consolas" w:hAnsi="Consolas"/>
-          <w:color w:val="802020"/>
-        </w:rPr>
-        <w:t>memory_fill</w:t>
-      </w:r>
-      <w:r>
-        <w:t xml:space="preserve"> and take part in retrieval. With </w:t>
-      </w:r>
-      <w:r>
-        <w:rPr>
-          <w:rFonts w:ascii="Consolas" w:hAnsi="Consolas"/>
-          <w:color w:val="802020"/>
-        </w:rPr>
-        <w:t>softmax_threshold=None</w:t>
-      </w:r>
-      <w:r>
-        <w:t xml:space="preserve">, stored scores </w:t>
-      </w:r>
-      <w:r>
-        <w:rPr>
-          <w:rFonts w:ascii="Consolas" w:hAnsi="Consolas"/>
-          <w:color w:val="802020"/>
-        </w:rPr>
-        <w:t>[4, 3]</w:t>
-      </w:r>
-      <w:r>
-        <w:t xml:space="preserve"> and two empty slots, it retrieved </w:t>
-      </w:r>
-      <w:r>
-        <w:rPr>
-          <w:rFonts w:ascii="Consolas" w:hAnsi="Consolas"/>
-          <w:color w:val="802020"/>
-        </w:rPr>
-        <w:t>1.236</w:t>
-      </w:r>
-      <w:r>
-        <w:t xml:space="preserve"> instead of </w:t>
-      </w:r>
-      <w:r>
-        <w:rPr>
-          <w:rFonts w:ascii="Consolas" w:hAnsi="Consolas"/>
-          <w:color w:val="802020"/>
-        </w:rPr>
-        <w:t>1.269</w:t>
-      </w:r>
-      <w:r>
-        <w:t xml:space="preserve">. The default </w:t>
-      </w:r>
-      <w:r>
-        <w:rPr>
-          <w:rFonts w:ascii="Consolas" w:hAnsi="Consolas"/>
-          <w:color w:val="802020"/>
-        </w:rPr>
-        <w:t>softmax_threshold=.001</w:t>
-      </w:r>
-      <w:r>
-        <w:t xml:space="preserve"> masks the empty slots, but also real scores of 0: with one stored key scoring exactly 0, nothing was retrieved.</w:t>
-      </w:r>
-    </w:p>
-    <w:p>
-      <w:pPr>
-        <w:ind w:left="360" w:hanging="360"/>
-      </w:pPr>
-      <w:r>
-        <w:t>6.</w:t>
-        <w:tab/>
-      </w:r>
-      <w:r>
-        <w:t xml:space="preserve">Other defaults change retrieval: </w:t>
-      </w:r>
-      <w:r>
-        <w:rPr>
-          <w:rFonts w:ascii="Consolas" w:hAnsi="Consolas"/>
-          <w:color w:val="802020"/>
-        </w:rPr>
-        <w:t>normalize_memories=True</w:t>
-      </w:r>
-      <w:r>
-        <w:t xml:space="preserve"> gives cosine similarity instead of the dot product, and </w:t>
-      </w:r>
-      <w:r>
-        <w:rPr>
-          <w:rFonts w:ascii="Consolas" w:hAnsi="Consolas"/>
-          <w:color w:val="802020"/>
-        </w:rPr>
-        <w:t>memory_decay_rate=AUTO</w:t>
-      </w:r>
-      <w:r>
-        <w:t xml:space="preserve"> decays stored entries.</w:t>
-      </w:r>
-    </w:p>
-    <w:p>
-      <w:pPr>
-        <w:pStyle w:val="Heading2"/>
-      </w:pPr>
-      <w:r>
-        <w:t>4. MatrixMemory (EMComposition's internal memory)</w:t>
-      </w:r>
-    </w:p>
-    <w:p>
-      <w:pPr>
-        <w:ind w:left="360" w:hanging="360"/>
-      </w:pPr>
-      <w:r>
-        <w:t>1.</w:t>
-        <w:tab/>
-      </w:r>
-      <w:r>
-        <w:t>It can't be constructed on its own: the constructor runs the function without saying which operation to perform (compute scores, retrieve or store), and building the resulting error message crashes (</w:t>
-      </w:r>
-      <w:r>
-        <w:rPr>
-          <w:rFonts w:ascii="Consolas" w:hAnsi="Consolas"/>
-          <w:color w:val="802020"/>
-        </w:rPr>
-        <w:t>'NoneType' object has no attribute 'name'</w:t>
-      </w:r>
-      <w:r>
-        <w:t>).</w:t>
-      </w:r>
-    </w:p>
-    <w:p>
-      <w:pPr>
-        <w:pStyle w:val="Heading2"/>
-      </w:pPr>
-      <w:r>
-        <w:t>5. Custom PyTorch memory inside PsyNeuLink</w:t>
-      </w:r>
-    </w:p>
-    <w:p>
-      <w:r>
-        <w:t>The memories were written as custom functions (</w:t>
-      </w:r>
-      <w:r>
-        <w:rPr>
-          <w:rFonts w:ascii="Consolas" w:hAnsi="Consolas"/>
-          <w:color w:val="802020"/>
-        </w:rPr>
-        <w:t>UserDefinedFunction</w:t>
-      </w:r>
-      <w:r>
-        <w:t xml:space="preserve"> with a </w:t>
-      </w:r>
-      <w:r>
-        <w:rPr>
-          <w:rFonts w:ascii="Consolas" w:hAnsi="Consolas"/>
-          <w:color w:val="802020"/>
-        </w:rPr>
-        <w:t>pytorch_function_generator</w:t>
-      </w:r>
-      <w:r>
-        <w:t xml:space="preserve">), with the stored entries carried from step to step by feedback projections, and each sequence run as one trial in </w:t>
-      </w:r>
-      <w:r>
-        <w:rPr>
-          <w:rFonts w:ascii="Consolas" w:hAnsi="Consolas"/>
-          <w:color w:val="802020"/>
-        </w:rPr>
-        <w:t>full_sequence_mode</w:t>
-      </w:r>
-      <w:r>
-        <w:t>. A loop through a second node does carry values across steps, and backpropagation through it gave the correct gradients on a small example. Getting the full model to train needed these workarounds, each found by running it:</w:t>
-      </w:r>
-    </w:p>
-    <w:p>
-      <w:pPr>
-        <w:ind w:left="360" w:hanging="360"/>
-      </w:pPr>
-      <w:r>
-        <w:t>1.</w:t>
-        <w:tab/>
-      </w:r>
-      <w:r>
-        <w:t>A projection from a node to itself is dropped in PyTorch mode (nothing accumulated), so each memory loops through a second "delay" node.</w:t>
-      </w:r>
-    </w:p>
-    <w:p>
-      <w:pPr>
-        <w:ind w:left="360" w:hanging="360"/>
-      </w:pPr>
-      <w:r>
-        <w:t>2.</w:t>
-        <w:tab/>
-      </w:r>
-      <w:r>
-        <w:rPr>
-          <w:rFonts w:ascii="Consolas" w:hAnsi="Consolas"/>
-          <w:color w:val="802020"/>
-        </w:rPr>
-        <w:t>add_projection(..., feedback=True)</w:t>
-      </w:r>
-      <w:r>
-        <w:t xml:space="preserve"> isn't enough for learning: the learning setup reports a cycle unless the projection itself is constructed with </w:t>
-      </w:r>
-      <w:r>
-        <w:rPr>
-          <w:rFonts w:ascii="Consolas" w:hAnsi="Consolas"/>
-          <w:color w:val="802020"/>
-        </w:rPr>
-        <w:t>feedback=True</w:t>
-      </w:r>
-      <w:r>
-        <w:t>.</w:t>
-      </w:r>
-    </w:p>
-    <w:p>
-      <w:pPr>
-        <w:ind w:left="360" w:hanging="360"/>
-      </w:pPr>
-      <w:r>
-        <w:t>3.</w:t>
-        <w:tab/>
-      </w:r>
-      <w:r>
-        <w:t xml:space="preserve">A feedback projection into the nested </w:t>
-      </w:r>
-      <w:r>
-        <w:rPr>
-          <w:rFonts w:ascii="Consolas" w:hAnsi="Consolas"/>
-          <w:color w:val="802020"/>
-        </w:rPr>
-        <w:t>GRUComposition</w:t>
-      </w:r>
-      <w:r>
-        <w:t xml:space="preserve"> fails either way: constructed with </w:t>
-      </w:r>
-      <w:r>
-        <w:rPr>
-          <w:rFonts w:ascii="Consolas" w:hAnsi="Consolas"/>
-          <w:color w:val="802020"/>
-        </w:rPr>
-        <w:t>feedback=True</w:t>
-      </w:r>
-      <w:r>
-        <w:t xml:space="preserve"> it raises a </w:t>
-      </w:r>
-      <w:r>
-        <w:rPr>
-          <w:rFonts w:ascii="Consolas" w:hAnsi="Consolas"/>
-          <w:color w:val="802020"/>
-        </w:rPr>
-        <w:t>KeyError</w:t>
-      </w:r>
-      <w:r>
-        <w:t>, and without it the learning setup reports a cycle. So the feedback has to end at a plain node in front of the GRU.</w:t>
-      </w:r>
-    </w:p>
-    <w:p>
-      <w:pPr>
-        <w:ind w:left="360" w:hanging="360"/>
-      </w:pPr>
-      <w:r>
-        <w:t>4.</w:t>
-        <w:tab/>
-      </w:r>
-      <w:r>
-        <w:t>Before a feedback projection's sender has run, the projection sends a default the size of its receiver through its matrix, which crashes unless the matrix is square.</w:t>
-      </w:r>
-    </w:p>
-    <w:p>
-      <w:pPr>
-        <w:ind w:left="360" w:hanging="360"/>
-      </w:pPr>
-      <w:r>
-        <w:t>5.</w:t>
-        <w:tab/>
-      </w:r>
-      <w:r>
-        <w:rPr>
-          <w:rFonts w:ascii="Consolas" w:hAnsi="Consolas"/>
-          <w:color w:val="802020"/>
-        </w:rPr>
-        <w:t>DEFAULT_INPUT: DEFAULT_VARIABLE</w:t>
-      </w:r>
-      <w:r>
-        <w:t xml:space="preserve"> in a port specification dict is ignored, so </w:t>
-      </w:r>
-      <w:r>
-        <w:rPr>
-          <w:rFonts w:ascii="Consolas" w:hAnsi="Consolas"/>
-          <w:color w:val="802020"/>
-        </w:rPr>
-        <w:t>const_one</w:t>
-      </w:r>
-      <w:r>
-        <w:t xml:space="preserve"> is an ordinary INPUT node rather than a BIAS node; it has to be given as an </w:t>
-      </w:r>
-      <w:r>
-        <w:rPr>
-          <w:rFonts w:ascii="Consolas" w:hAnsi="Consolas"/>
-          <w:color w:val="802020"/>
-        </w:rPr>
-        <w:t>InputPort</w:t>
-      </w:r>
-      <w:r>
-        <w:t xml:space="preserve"> object.</w:t>
-      </w:r>
-    </w:p>
-    <w:p>
-      <w:pPr>
-        <w:ind w:left="360" w:hanging="360"/>
-      </w:pPr>
-      <w:r>
-        <w:t>6.</w:t>
-        <w:tab/>
-      </w:r>
-      <w:r>
-        <w:t>The memory carried over from the previous minibatch keeps its autograd graph, so the next backward pass fails (</w:t>
-      </w:r>
-      <w:r>
-        <w:rPr>
-          <w:rFonts w:ascii="Consolas" w:hAnsi="Consolas"/>
-          <w:color w:val="802020"/>
-        </w:rPr>
-        <w:t>one of the variables needed for gradient computation has been modified by an inplace operation</w:t>
-      </w:r>
-      <w:r>
-        <w:t>). The memories have to be replaced with new zero tensors at the end of each sequence.</w:t>
-      </w:r>
-    </w:p>
-    <w:p>
-      <w:pPr>
-        <w:ind w:left="360" w:hanging="360"/>
-      </w:pPr>
-      <w:r>
-        <w:t>7.</w:t>
-        <w:tab/>
-      </w:r>
-      <w:r>
-        <w:t>Copying the GRU's node values back from PyTorch fails for minibatches of more than one sequence (a shape-mismatch assertion), so node-value copying has to be turned off.</w:t>
-      </w:r>
-    </w:p>
-    <w:p>
-      <w:pPr>
-        <w:ind w:left="360" w:hanging="360"/>
-      </w:pPr>
-      <w:r>
-        <w:t>8.</w:t>
-        <w:tab/>
-      </w:r>
-      <w:r>
-        <w:t xml:space="preserve">Testing with </w:t>
-      </w:r>
-      <w:r>
-        <w:rPr>
-          <w:rFonts w:ascii="Consolas" w:hAnsi="Consolas"/>
-          <w:color w:val="802020"/>
-        </w:rPr>
-        <w:t>learn(learning_rate=0)</w:t>
-      </w:r>
-      <w:r>
-        <w:t xml:space="preserve"> doesn't revert: later training no longer changed the weights.</w:t>
-      </w:r>
-    </w:p>
-    <w:p>
-      <w:r>
-        <w:t>With these, the model trains (32 sequences in about 6 seconds), but it hasn't been checked against the plain-PyTorch version, and the memory itself is PyTorch code inside custom functions: PsyNeuLink only provides the wiring. The plain-PyTorch ESBN, with the memory as ordinary Python lists, reached 100% accuracy on objects it never saw in training in one run (88% in another, from a different random start).</w:t>
       </w:r>
     </w:p>
     <w:p>

</xml_diff>

<commit_message>
Report: fold memory section into missing functionality, drop PyTorch step
Co-Authored-By: Claude Opus 5.5 <noreply@anthropic.com>
Claude-Session: https://claude.ai/code/session_01Pj1PPavthJ9iFe8XHJiggU
</commit_message>
<xml_diff>
--- a/pnl_issues.docx
+++ b/pnl_issues.docx
@@ -482,7 +482,7 @@
         <w:t>[0]</w:t>
       </w:r>
       <w:r>
-        <w:t xml:space="preserve"> as its scores. So it starts with a placeholder key, whose score the padding function drops by position.</w:t>
+        <w:t xml:space="preserve"> as its scores (indistinguishable from one stored key scoring 0; an output port reading it is also built 1 wide). So it starts with a placeholder key. With a zero key and a dot-product metric, the placeholder always scores 0, the same as a padded empty slot or a real score of 0, so it can't be recognized from the output and the padding function has to drop it by position.</w:t>
       </w:r>
     </w:p>
     <w:p>
@@ -607,7 +607,37 @@
         <w:tab/>
       </w:r>
       <w:r>
-        <w:t xml:space="preserve">It can't start empty with vector entries, the placeholder is never dropped, and </w:t>
+        <w:t xml:space="preserve">It can't start empty with vector entries (an empty </w:t>
+      </w:r>
+      <w:r>
+        <w:rPr>
+          <w:rFonts w:ascii="Consolas" w:hAnsi="Consolas"/>
+          <w:color w:val="802020"/>
+        </w:rPr>
+        <w:t>initializer</w:t>
+      </w:r>
+      <w:r>
+        <w:t xml:space="preserve"> raises </w:t>
+      </w:r>
+      <w:r>
+        <w:rPr>
+          <w:rFonts w:ascii="Consolas" w:hAnsi="Consolas"/>
+          <w:color w:val="802020"/>
+        </w:rPr>
+        <w:t>initializer ([]) is incompatible with its default_variable</w:t>
+      </w:r>
+      <w:r>
+        <w:t xml:space="preserve">), and the placeholder is never dropped, so it holds </w:t>
+      </w:r>
+      <w:r>
+        <w:rPr>
+          <w:rFonts w:ascii="Consolas" w:hAnsi="Consolas"/>
+          <w:color w:val="802020"/>
+        </w:rPr>
+        <w:t>[placeholder, v_0, v_1, …]</w:t>
+      </w:r>
+      <w:r>
+        <w:t xml:space="preserve">. </w:t>
       </w:r>
       <w:r>
         <w:rPr>
@@ -617,7 +647,7 @@
         <w:t>reset()</w:t>
       </w:r>
       <w:r>
-        <w:t xml:space="preserve"> restores it (only </w:t>
+        <w:t xml:space="preserve"> restores the placeholder and only </w:t>
       </w:r>
       <w:r>
         <w:rPr>
@@ -627,7 +657,17 @@
         <w:t>reset([])</w:t>
       </w:r>
       <w:r>
-        <w:t xml:space="preserve"> empties it).</w:t>
+        <w:t xml:space="preserve"> empties it, so with </w:t>
+      </w:r>
+      <w:r>
+        <w:rPr>
+          <w:rFonts w:ascii="Consolas" w:hAnsi="Consolas"/>
+          <w:color w:val="802020"/>
+        </w:rPr>
+        <w:t>reset([])</w:t>
+      </w:r>
+      <w:r>
+        <w:t xml:space="preserve"> between sequences, the first sequence has the placeholder and later ones don't.</w:t>
       </w:r>
     </w:p>
     <w:p>
@@ -639,6 +679,18 @@
         <w:tab/>
       </w:r>
       <w:r>
+        <w:t>As a result, every function downstream of these memories has to know each one's placeholder convention: the offset of the first real entry, whether capacity checks count the placeholder, and which reset method was used.</w:t>
+      </w:r>
+    </w:p>
+    <w:p>
+      <w:pPr>
+        <w:ind w:left="360" w:hanging="360"/>
+      </w:pPr>
+      <w:r>
+        <w:t>4.</w:t>
+        <w:tab/>
+      </w:r>
+      <w:r>
         <w:rPr>
           <w:rFonts w:ascii="Consolas" w:hAnsi="Consolas"/>
           <w:color w:val="802020"/>
@@ -664,10 +716,23 @@
         <w:rPr>
           <w:b/>
         </w:rPr>
-        <w:t>So next:</w:t>
-      </w:r>
-      <w:r>
-        <w:t xml:space="preserve"> since no PsyNeuLink memory can be trained, write the memories as custom PyTorch functions inside the PsyNeuLink model.</w:t>
+        <w:t>Result:</w:t>
+      </w:r>
+      <w:r>
+        <w:t xml:space="preserve"> none of PsyNeuLink's memories can both give the raw dot products and be trained, so ESBN can't be built as a trainable PsyNeuLink model.</w:t>
+      </w:r>
+    </w:p>
+    <w:p>
+      <w:pPr>
+        <w:pStyle w:val="Heading1"/>
+      </w:pPr>
+      <w:r>
+        <w:t>Missing functionality</w:t>
+      </w:r>
+    </w:p>
+    <w:p>
+      <w:r>
+        <w:t>Ordered by significance relative to implementation difficulty.</w:t>
       </w:r>
     </w:p>
     <w:p>
@@ -675,296 +740,7 @@
         <w:pStyle w:val="Heading2"/>
       </w:pPr>
       <w:r>
-        <w:t>Step 5: Custom PyTorch memory inside PsyNeuLink</w:t>
-      </w:r>
-    </w:p>
-    <w:p>
-      <w:r>
-        <w:rPr>
-          <w:b/>
-        </w:rPr>
-        <w:t>Why it was tried:</w:t>
-      </w:r>
-      <w:r>
-        <w:t xml:space="preserve"> a </w:t>
-      </w:r>
-      <w:r>
-        <w:rPr>
-          <w:rFonts w:ascii="Consolas" w:hAnsi="Consolas"/>
-          <w:color w:val="802020"/>
-        </w:rPr>
-        <w:t>UserDefinedFunction</w:t>
-      </w:r>
-      <w:r>
-        <w:t xml:space="preserve"> with a </w:t>
-      </w:r>
-      <w:r>
-        <w:rPr>
-          <w:rFonts w:ascii="Consolas" w:hAnsi="Consolas"/>
-          <w:color w:val="802020"/>
-        </w:rPr>
-        <w:t>pytorch_function_generator</w:t>
-      </w:r>
-      <w:r>
-        <w:t xml:space="preserve"> is accepted by </w:t>
-      </w:r>
-      <w:r>
-        <w:rPr>
-          <w:rFonts w:ascii="Consolas" w:hAnsi="Consolas"/>
-          <w:color w:val="802020"/>
-        </w:rPr>
-        <w:t>learn()</w:t>
-      </w:r>
-      <w:r>
-        <w:t xml:space="preserve">. The memories were written as such functions, with the stored entries carried from step to step by feedback projections, and each sequence run as one trial in </w:t>
-      </w:r>
-      <w:r>
-        <w:rPr>
-          <w:rFonts w:ascii="Consolas" w:hAnsi="Consolas"/>
-          <w:color w:val="802020"/>
-        </w:rPr>
-        <w:t>full_sequence_mode</w:t>
-      </w:r>
-      <w:r>
-        <w:t>. A loop through a second node does carry values across steps, and backpropagation through it gave the correct gradients on a small example.</w:t>
-      </w:r>
-    </w:p>
-    <w:p>
-      <w:r>
-        <w:rPr>
-          <w:b/>
-        </w:rPr>
-        <w:t>Why it fails:</w:t>
-      </w:r>
-      <w:r>
-        <w:t xml:space="preserve"> getting the full model to train needed these workarounds, each found by running it:</w:t>
-      </w:r>
-    </w:p>
-    <w:p>
-      <w:pPr>
-        <w:ind w:left="360" w:hanging="360"/>
-      </w:pPr>
-      <w:r>
-        <w:t>1.</w:t>
-        <w:tab/>
-      </w:r>
-      <w:r>
-        <w:t>A projection from a node to itself is dropped in PyTorch mode (nothing accumulated), so each memory loops through a second "delay" node.</w:t>
-      </w:r>
-    </w:p>
-    <w:p>
-      <w:pPr>
-        <w:ind w:left="360" w:hanging="360"/>
-      </w:pPr>
-      <w:r>
-        <w:t>2.</w:t>
-        <w:tab/>
-      </w:r>
-      <w:r>
-        <w:rPr>
-          <w:rFonts w:ascii="Consolas" w:hAnsi="Consolas"/>
-          <w:color w:val="802020"/>
-        </w:rPr>
-        <w:t>add_projection(..., feedback=True)</w:t>
-      </w:r>
-      <w:r>
-        <w:t xml:space="preserve"> isn't enough for learning: the learning setup reports a cycle unless the projection itself is constructed with </w:t>
-      </w:r>
-      <w:r>
-        <w:rPr>
-          <w:rFonts w:ascii="Consolas" w:hAnsi="Consolas"/>
-          <w:color w:val="802020"/>
-        </w:rPr>
-        <w:t>feedback=True</w:t>
-      </w:r>
-      <w:r>
-        <w:t>.</w:t>
-      </w:r>
-    </w:p>
-    <w:p>
-      <w:pPr>
-        <w:ind w:left="360" w:hanging="360"/>
-      </w:pPr>
-      <w:r>
-        <w:t>3.</w:t>
-        <w:tab/>
-      </w:r>
-      <w:r>
-        <w:t xml:space="preserve">A feedback projection into the nested </w:t>
-      </w:r>
-      <w:r>
-        <w:rPr>
-          <w:rFonts w:ascii="Consolas" w:hAnsi="Consolas"/>
-          <w:color w:val="802020"/>
-        </w:rPr>
-        <w:t>GRUComposition</w:t>
-      </w:r>
-      <w:r>
-        <w:t xml:space="preserve"> fails either way: constructed with </w:t>
-      </w:r>
-      <w:r>
-        <w:rPr>
-          <w:rFonts w:ascii="Consolas" w:hAnsi="Consolas"/>
-          <w:color w:val="802020"/>
-        </w:rPr>
-        <w:t>feedback=True</w:t>
-      </w:r>
-      <w:r>
-        <w:t xml:space="preserve"> it raises a </w:t>
-      </w:r>
-      <w:r>
-        <w:rPr>
-          <w:rFonts w:ascii="Consolas" w:hAnsi="Consolas"/>
-          <w:color w:val="802020"/>
-        </w:rPr>
-        <w:t>KeyError</w:t>
-      </w:r>
-      <w:r>
-        <w:t>, and without it the learning setup reports a cycle. So the feedback has to end at a plain node in front of the GRU.</w:t>
-      </w:r>
-    </w:p>
-    <w:p>
-      <w:pPr>
-        <w:ind w:left="360" w:hanging="360"/>
-      </w:pPr>
-      <w:r>
-        <w:t>4.</w:t>
-        <w:tab/>
-      </w:r>
-      <w:r>
-        <w:t>Before a feedback projection's sender has run, the projection sends a default the size of its receiver through its matrix, which crashes unless the matrix is square.</w:t>
-      </w:r>
-    </w:p>
-    <w:p>
-      <w:pPr>
-        <w:ind w:left="360" w:hanging="360"/>
-      </w:pPr>
-      <w:r>
-        <w:t>5.</w:t>
-        <w:tab/>
-      </w:r>
-      <w:r>
-        <w:rPr>
-          <w:rFonts w:ascii="Consolas" w:hAnsi="Consolas"/>
-          <w:color w:val="802020"/>
-        </w:rPr>
-        <w:t>DEFAULT_INPUT: DEFAULT_VARIABLE</w:t>
-      </w:r>
-      <w:r>
-        <w:t xml:space="preserve"> in a port specification dict is ignored, so </w:t>
-      </w:r>
-      <w:r>
-        <w:rPr>
-          <w:rFonts w:ascii="Consolas" w:hAnsi="Consolas"/>
-          <w:color w:val="802020"/>
-        </w:rPr>
-        <w:t>const_one</w:t>
-      </w:r>
-      <w:r>
-        <w:t xml:space="preserve"> is an ordinary INPUT node rather than a BIAS node; it has to be given as an </w:t>
-      </w:r>
-      <w:r>
-        <w:rPr>
-          <w:rFonts w:ascii="Consolas" w:hAnsi="Consolas"/>
-          <w:color w:val="802020"/>
-        </w:rPr>
-        <w:t>InputPort</w:t>
-      </w:r>
-      <w:r>
-        <w:t xml:space="preserve"> object.</w:t>
-      </w:r>
-    </w:p>
-    <w:p>
-      <w:pPr>
-        <w:ind w:left="360" w:hanging="360"/>
-      </w:pPr>
-      <w:r>
-        <w:t>6.</w:t>
-        <w:tab/>
-      </w:r>
-      <w:r>
-        <w:t>The memory carried over from the previous minibatch keeps its autograd graph, so the next backward pass fails (</w:t>
-      </w:r>
-      <w:r>
-        <w:rPr>
-          <w:rFonts w:ascii="Consolas" w:hAnsi="Consolas"/>
-          <w:color w:val="802020"/>
-        </w:rPr>
-        <w:t>one of the variables needed for gradient computation has been modified by an inplace operation</w:t>
-      </w:r>
-      <w:r>
-        <w:t>). The memories have to be replaced with new zero tensors at the end of each sequence.</w:t>
-      </w:r>
-    </w:p>
-    <w:p>
-      <w:pPr>
-        <w:ind w:left="360" w:hanging="360"/>
-      </w:pPr>
-      <w:r>
-        <w:t>7.</w:t>
-        <w:tab/>
-      </w:r>
-      <w:r>
-        <w:t>Copying the GRU's node values back from PyTorch fails for minibatches of more than one sequence (a shape-mismatch assertion), so node-value copying has to be turned off.</w:t>
-      </w:r>
-    </w:p>
-    <w:p>
-      <w:pPr>
-        <w:ind w:left="360" w:hanging="360"/>
-      </w:pPr>
-      <w:r>
-        <w:t>8.</w:t>
-        <w:tab/>
-      </w:r>
-      <w:r>
-        <w:t xml:space="preserve">Testing with </w:t>
-      </w:r>
-      <w:r>
-        <w:rPr>
-          <w:rFonts w:ascii="Consolas" w:hAnsi="Consolas"/>
-          <w:color w:val="802020"/>
-        </w:rPr>
-        <w:t>learn(learning_rate=0)</w:t>
-      </w:r>
-      <w:r>
-        <w:t xml:space="preserve"> doesn't revert: later training no longer changed the weights.</w:t>
-      </w:r>
-    </w:p>
-    <w:p>
-      <w:r>
-        <w:t>With these, the model trains (32 sequences in about 6 seconds), but it hasn't been checked against the plain-PyTorch version. And at this point the memory is PyTorch code inside custom functions: PsyNeuLink only provides the wiring, so it is no longer a PsyNeuLink memory.</w:t>
-      </w:r>
-    </w:p>
-    <w:p>
-      <w:r>
-        <w:rPr>
-          <w:b/>
-        </w:rPr>
-        <w:t>Result:</w:t>
-      </w:r>
-      <w:r>
-        <w:t xml:space="preserve"> the plain-PyTorch ESBN, with the memory as ordinary Python lists, reached 100% accuracy on objects it never saw in training in one run (88% in another, from a different random start).</w:t>
-      </w:r>
-    </w:p>
-    <w:p>
-      <w:pPr>
-        <w:pStyle w:val="Heading1"/>
-      </w:pPr>
-      <w:r>
-        <w:t>Memory structures</w:t>
-      </w:r>
-    </w:p>
-    <w:p>
-      <w:r>
-        <w:t>This is the main reason ESBN couldn't be built in PsyNeuLink. ESBN needs two memories that start empty for each sequence, grow by one entry per step, and expose the raw query-key dot products; none of PsyNeuLink's memory structures does all of this.</w:t>
-      </w:r>
-    </w:p>
-    <w:p>
-      <w:pPr>
-        <w:pStyle w:val="Heading2"/>
-      </w:pPr>
-      <w:r>
-        <w:t>Key-value memory is limited</w:t>
+        <w:t>Memory</w:t>
       </w:r>
     </w:p>
     <w:p>
@@ -972,7 +748,59 @@
         <w:pStyle w:val="ListBullet"/>
       </w:pPr>
       <w:r>
-        <w:t xml:space="preserve">Storing a key and its value as a pair: </w:t>
+        <w:t xml:space="preserve">A separate raw-scores output on </w:t>
+      </w:r>
+      <w:r>
+        <w:rPr>
+          <w:rFonts w:ascii="Consolas" w:hAnsi="Consolas"/>
+          <w:color w:val="802020"/>
+        </w:rPr>
+        <w:t>EMComposition</w:t>
+      </w:r>
+      <w:r>
+        <w:t xml:space="preserve"> (step 1), updated only on the run that computes the scores, and supported in its PyTorch version as well.</w:t>
+      </w:r>
+    </w:p>
+    <w:p>
+      <w:pPr>
+        <w:pStyle w:val="ListBullet"/>
+      </w:pPr>
+      <w:r>
+        <w:t xml:space="preserve">Separate control of storage and retrieval on each trial, and a way to clear </w:t>
+      </w:r>
+      <w:r>
+        <w:rPr>
+          <w:rFonts w:ascii="Consolas" w:hAnsi="Consolas"/>
+          <w:color w:val="802020"/>
+        </w:rPr>
+        <w:t>EMComposition</w:t>
+      </w:r>
+      <w:r>
+        <w:t>'s memory between sequences (step 1).</w:t>
+      </w:r>
+    </w:p>
+    <w:p>
+      <w:pPr>
+        <w:pStyle w:val="ListBullet"/>
+      </w:pPr>
+      <w:r>
+        <w:t>Empty memories (an empty initializer with a declared entry shape), or a designated placeholder that's dropped on the first write (steps 3 and 4).</w:t>
+      </w:r>
+    </w:p>
+    <w:p>
+      <w:pPr>
+        <w:pStyle w:val="ListBullet"/>
+      </w:pPr>
+      <w:r>
+        <w:t>The number of stored entries, or a mask of filled slots, as an output, so padding and masking downstream don't depend on placeholder conventions.</w:t>
+      </w:r>
+    </w:p>
+    <w:p>
+      <w:pPr>
+        <w:pStyle w:val="ListBullet"/>
+      </w:pPr>
+      <w:r>
+        <w:t xml:space="preserve">PyTorch support for </w:t>
       </w:r>
       <w:r>
         <w:rPr>
@@ -982,137 +810,8 @@
         <w:t>ContentAddressableMemory</w:t>
       </w:r>
       <w:r>
-        <w:t xml:space="preserve"> supports multiple fields, but its weighted (softmax) retrieval only works with </w:t>
-      </w:r>
-      <w:r>
-        <w:rPr>
-          <w:rFonts w:ascii="Consolas" w:hAnsi="Consolas"/>
-          <w:color w:val="802020"/>
-        </w:rPr>
-        <w:t>duplicate_entries_allowed=False</w:t>
-      </w:r>
-      <w:r>
-        <w:t xml:space="preserve"> (</w:t>
-      </w:r>
-      <w:r>
-        <w:rPr>
-          <w:rFonts w:ascii="Consolas" w:hAnsi="Consolas"/>
-          <w:color w:val="802020"/>
-        </w:rPr>
-        <w:t>memoryfunctions.py:1405-1417</w:t>
-      </w:r>
-      <w:r>
-        <w:t xml:space="preserve">). In that mode a repeated entry isn't stored: 3 inputs, one of them repeated, stored only 2 entries. </w:t>
-      </w:r>
-      <w:r>
-        <w:rPr>
-          <w:rFonts w:ascii="Consolas" w:hAnsi="Consolas"/>
-          <w:color w:val="802020"/>
-        </w:rPr>
-        <w:t>EMComposition</w:t>
-      </w:r>
-      <w:r>
-        <w:t xml:space="preserve"> stores key and value fields together, but it has a fixed capacity and doesn't allow adding nodes. In practice, it was simpler to keep keys and values in separate memories, aligned by slot.</w:t>
-      </w:r>
-    </w:p>
-    <w:p>
-      <w:pPr>
-        <w:pStyle w:val="ListBullet"/>
-      </w:pPr>
-      <w:r>
-        <w:t xml:space="preserve">Raw query-key dot products can't be read out of </w:t>
-      </w:r>
-      <w:r>
-        <w:rPr>
-          <w:rFonts w:ascii="Consolas" w:hAnsi="Consolas"/>
-          <w:color w:val="802020"/>
-        </w:rPr>
-        <w:t>EMComposition</w:t>
-      </w:r>
-      <w:r>
-        <w:t>. The key field's memory node runs twice per trial: the first run computes the raw scores (</w:t>
-      </w:r>
-      <w:r>
-        <w:rPr>
-          <w:rFonts w:ascii="Consolas" w:hAnsi="Consolas"/>
-          <w:color w:val="802020"/>
-        </w:rPr>
-        <w:t>[4, 3]</w:t>
-      </w:r>
-      <w:r>
-        <w:t xml:space="preserve">), and the second overwrites the same </w:t>
-      </w:r>
-      <w:r>
-        <w:rPr>
-          <w:rFonts w:ascii="Consolas" w:hAnsi="Consolas"/>
-          <w:color w:val="802020"/>
-        </w:rPr>
-        <w:t>SCORES</w:t>
-      </w:r>
-      <w:r>
-        <w:t xml:space="preserve"> output with softmaxed weights (</w:t>
-      </w:r>
-      <w:r>
-        <w:rPr>
-          <w:rFonts w:ascii="Consolas" w:hAnsi="Consolas"/>
-          <w:color w:val="802020"/>
-        </w:rPr>
-        <w:t>[0.7311, 0.2689]</w:t>
-      </w:r>
-      <w:r>
-        <w:t xml:space="preserve">). A node outside the EMComposition connected to </w:t>
-      </w:r>
-      <w:r>
-        <w:rPr>
-          <w:rFonts w:ascii="Consolas" w:hAnsi="Consolas"/>
-          <w:color w:val="802020"/>
-        </w:rPr>
-        <w:t>SCORES</w:t>
-      </w:r>
-      <w:r>
-        <w:t xml:space="preserve"> receives only the softmaxed values. Adding a node inside raises </w:t>
-      </w:r>
-      <w:r>
-        <w:rPr>
-          <w:rFonts w:ascii="Consolas" w:hAnsi="Consolas"/>
-          <w:color w:val="802020"/>
-        </w:rPr>
-        <w:t>Nodes cannot be added to an EMComposition</w:t>
-      </w:r>
-      <w:r>
-        <w:t xml:space="preserve">. Softmax can't be inverted, because it keeps only the differences between scores. Logging captures the raw scores, but only for inspection after the trial. Anything that needs per-key raw scores (e.g. ESBN's confidence gate, </w:t>
-      </w:r>
-      <w:r>
-        <w:rPr>
-          <w:rFonts w:ascii="Consolas" w:hAnsi="Consolas"/>
-          <w:color w:val="802020"/>
-        </w:rPr>
-        <w:t>σ(γ·s + β)</w:t>
-      </w:r>
-      <w:r>
-        <w:t>) can't be built on it.</w:t>
-      </w:r>
-    </w:p>
-    <w:p>
-      <w:pPr>
-        <w:pStyle w:val="ListBullet"/>
-      </w:pPr>
-      <w:r>
-        <w:t>Proposal: a separate raw-scores output that's only updated on the score-computing run, supported in EMComposition's PyTorch version as well.</w:t>
-      </w:r>
-    </w:p>
-    <w:p>
-      <w:pPr>
-        <w:pStyle w:val="ListBullet"/>
-      </w:pPr>
-      <w:r>
-        <w:t>Empty memories and placeholders:</w:t>
-      </w:r>
-    </w:p>
-    <w:p>
-      <w:pPr>
-        <w:pStyle w:val="ListBullet2"/>
-      </w:pPr>
+        <w:t xml:space="preserve"> and </w:t>
+      </w:r>
       <w:r>
         <w:rPr>
           <w:rFonts w:ascii="Consolas" w:hAnsi="Consolas"/>
@@ -1121,300 +820,7 @@
         <w:t>Buffer</w:t>
       </w:r>
       <w:r>
-        <w:t xml:space="preserve"> can't start empty when its entries are vectors: an empty </w:t>
-      </w:r>
-      <w:r>
-        <w:rPr>
-          <w:rFonts w:ascii="Consolas" w:hAnsi="Consolas"/>
-          <w:color w:val="802020"/>
-        </w:rPr>
-        <w:t>initializer</w:t>
-      </w:r>
-      <w:r>
-        <w:t xml:space="preserve"> raises </w:t>
-      </w:r>
-      <w:r>
-        <w:rPr>
-          <w:rFonts w:ascii="Consolas" w:hAnsi="Consolas"/>
-          <w:color w:val="802020"/>
-        </w:rPr>
-        <w:t>initializer ([]) is incompatible with its default_variable</w:t>
-      </w:r>
-      <w:r>
-        <w:t>. It has to start with a placeholder entry of the right shape.</w:t>
-      </w:r>
-    </w:p>
-    <w:p>
-      <w:pPr>
-        <w:pStyle w:val="ListBullet2"/>
-      </w:pPr>
-      <w:r>
-        <w:t xml:space="preserve">Nothing removes the placeholder when the first real value arrives, so the memory holds </w:t>
-      </w:r>
-      <w:r>
-        <w:rPr>
-          <w:rFonts w:ascii="Consolas" w:hAnsi="Consolas"/>
-          <w:color w:val="802020"/>
-        </w:rPr>
-        <w:t>[placeholder, v_0, v_1, …]</w:t>
-      </w:r>
-      <w:r>
-        <w:t>. Every consumer has to skip index 0.</w:t>
-      </w:r>
-    </w:p>
-    <w:p>
-      <w:pPr>
-        <w:pStyle w:val="ListBullet2"/>
-      </w:pPr>
-      <w:r>
-        <w:rPr>
-          <w:rFonts w:ascii="Consolas" w:hAnsi="Consolas"/>
-          <w:color w:val="802020"/>
-        </w:rPr>
-        <w:t>Buffer</w:t>
-      </w:r>
-      <w:r>
-        <w:t>'s default output port passes on only its first stored item, which is the placeholder itself.</w:t>
-      </w:r>
-    </w:p>
-    <w:p>
-      <w:pPr>
-        <w:pStyle w:val="ListBullet2"/>
-      </w:pPr>
-      <w:r>
-        <w:rPr>
-          <w:rFonts w:ascii="Consolas" w:hAnsi="Consolas"/>
-          <w:color w:val="802020"/>
-        </w:rPr>
-        <w:t>reset()</w:t>
-      </w:r>
-      <w:r>
-        <w:t xml:space="preserve"> restores the placeholder, and only </w:t>
-      </w:r>
-      <w:r>
-        <w:rPr>
-          <w:rFonts w:ascii="Consolas" w:hAnsi="Consolas"/>
-          <w:color w:val="802020"/>
-        </w:rPr>
-        <w:t>reset([])</w:t>
-      </w:r>
-      <w:r>
-        <w:t xml:space="preserve"> empties the memory. So which layout the memory has depends on how it was last reset: with </w:t>
-      </w:r>
-      <w:r>
-        <w:rPr>
-          <w:rFonts w:ascii="Consolas" w:hAnsi="Consolas"/>
-          <w:color w:val="802020"/>
-        </w:rPr>
-        <w:t>reset([])</w:t>
-      </w:r>
-      <w:r>
-        <w:t xml:space="preserve"> between sequences, the first sequence has the placeholder and later ones don't.</w:t>
-      </w:r>
-    </w:p>
-    <w:p>
-      <w:pPr>
-        <w:pStyle w:val="ListBullet2"/>
-      </w:pPr>
-      <w:r>
-        <w:rPr>
-          <w:rFonts w:ascii="Consolas" w:hAnsi="Consolas"/>
-          <w:color w:val="802020"/>
-        </w:rPr>
-        <w:t>ContentAddressableMemory</w:t>
-      </w:r>
-      <w:r>
-        <w:t xml:space="preserve"> built without an initializer can't be reset: </w:t>
-      </w:r>
-      <w:r>
-        <w:rPr>
-          <w:rFonts w:ascii="Consolas" w:hAnsi="Consolas"/>
-          <w:color w:val="802020"/>
-        </w:rPr>
-        <w:t>reset()</w:t>
-      </w:r>
-      <w:r>
-        <w:t xml:space="preserve"> crashes (</w:t>
-      </w:r>
-      <w:r>
-        <w:rPr>
-          <w:rFonts w:ascii="Consolas" w:hAnsi="Consolas"/>
-          <w:color w:val="802020"/>
-        </w:rPr>
-        <w:t>'numpy.ndarray' object has no attribute 'clear'</w:t>
-      </w:r>
-      <w:r>
-        <w:t xml:space="preserve">, </w:t>
-      </w:r>
-      <w:r>
-        <w:rPr>
-          <w:rFonts w:ascii="Consolas" w:hAnsi="Consolas"/>
-          <w:color w:val="802020"/>
-        </w:rPr>
-        <w:t>memoryfunctions.py:1446</w:t>
-      </w:r>
-      <w:r>
-        <w:t>).</w:t>
-      </w:r>
-    </w:p>
-    <w:p>
-      <w:pPr>
-        <w:pStyle w:val="ListBullet2"/>
-      </w:pPr>
-      <w:r>
-        <w:t xml:space="preserve">An empty </w:t>
-      </w:r>
-      <w:r>
-        <w:rPr>
-          <w:rFonts w:ascii="Consolas" w:hAnsi="Consolas"/>
-          <w:color w:val="802020"/>
-        </w:rPr>
-        <w:t>ContentAddressableMemory</w:t>
-      </w:r>
-      <w:r>
-        <w:t xml:space="preserve"> reports </w:t>
-      </w:r>
-      <w:r>
-        <w:rPr>
-          <w:rFonts w:ascii="Consolas" w:hAnsi="Consolas"/>
-          <w:color w:val="802020"/>
-        </w:rPr>
-        <w:t>[0]</w:t>
-      </w:r>
-      <w:r>
-        <w:t xml:space="preserve"> as its scores (</w:t>
-      </w:r>
-      <w:r>
-        <w:rPr>
-          <w:rFonts w:ascii="Consolas" w:hAnsi="Consolas"/>
-          <w:color w:val="802020"/>
-        </w:rPr>
-        <w:t>distances_to_entries</w:t>
-      </w:r>
-      <w:r>
-        <w:t xml:space="preserve"> defaults to </w:t>
-      </w:r>
-      <w:r>
-        <w:rPr>
-          <w:rFonts w:ascii="Consolas" w:hAnsi="Consolas"/>
-          <w:color w:val="802020"/>
-        </w:rPr>
-        <w:t>[0]</w:t>
-      </w:r>
-      <w:r>
-        <w:t xml:space="preserve">, </w:t>
-      </w:r>
-      <w:r>
-        <w:rPr>
-          <w:rFonts w:ascii="Consolas" w:hAnsi="Consolas"/>
-          <w:color w:val="802020"/>
-        </w:rPr>
-        <w:t>memoryfunctions.py:1211</w:t>
-      </w:r>
-      <w:r>
-        <w:t>), which is indistinguishable from one stored key scoring 0. An output port reading it is also built 1 wide.</w:t>
-      </w:r>
-    </w:p>
-    <w:p>
-      <w:pPr>
-        <w:pStyle w:val="ListBullet2"/>
-      </w:pPr>
-      <w:r>
-        <w:t xml:space="preserve">So in practice </w:t>
-      </w:r>
-      <w:r>
-        <w:rPr>
-          <w:rFonts w:ascii="Consolas" w:hAnsi="Consolas"/>
-          <w:color w:val="802020"/>
-        </w:rPr>
-        <w:t>ContentAddressableMemory</w:t>
-      </w:r>
-      <w:r>
-        <w:t xml:space="preserve"> also needs a placeholder key. With a zero key and a dot-product metric, its score is always 0, the same value as a padded empty slot or a real score of 0, so it can't be recognized from the output and has to be dropped by position (as </w:t>
-      </w:r>
-      <w:r>
-        <w:rPr>
-          <w:rFonts w:ascii="Consolas" w:hAnsi="Consolas"/>
-          <w:color w:val="802020"/>
-        </w:rPr>
-        <w:t>main.py</w:t>
-      </w:r>
-      <w:r>
-        <w:t xml:space="preserve"> does with </w:t>
-      </w:r>
-      <w:r>
-        <w:rPr>
-          <w:rFonts w:ascii="Consolas" w:hAnsi="Consolas"/>
-          <w:color w:val="802020"/>
-        </w:rPr>
-        <w:t>[1:]</w:t>
-      </w:r>
-      <w:r>
-        <w:t>).</w:t>
-      </w:r>
-    </w:p>
-    <w:p>
-      <w:pPr>
-        <w:pStyle w:val="ListBullet2"/>
-      </w:pPr>
-      <w:r>
-        <w:rPr>
-          <w:rFonts w:ascii="Consolas" w:hAnsi="Consolas"/>
-          <w:color w:val="802020"/>
-        </w:rPr>
-        <w:t>EMComposition</w:t>
-      </w:r>
-      <w:r>
-        <w:t xml:space="preserve"> has no placeholder, but its fixed-capacity memory is pre-filled with </w:t>
-      </w:r>
-      <w:r>
-        <w:rPr>
-          <w:rFonts w:ascii="Consolas" w:hAnsi="Consolas"/>
-          <w:color w:val="802020"/>
-        </w:rPr>
-        <w:t>memory_fill</w:t>
-      </w:r>
-      <w:r>
-        <w:t xml:space="preserve">. With a fill of 0, empty slots score 0, and the default </w:t>
-      </w:r>
-      <w:r>
-        <w:rPr>
-          <w:rFonts w:ascii="Consolas" w:hAnsi="Consolas"/>
-          <w:color w:val="802020"/>
-        </w:rPr>
-        <w:t>softmax_threshold=.001</w:t>
-      </w:r>
-      <w:r>
-        <w:t xml:space="preserve"> masks them, but it also masks real scores of 0: with one stored key scoring exactly 0, nothing was retrieved.</w:t>
-      </w:r>
-    </w:p>
-    <w:p>
-      <w:pPr>
-        <w:pStyle w:val="ListBullet2"/>
-      </w:pPr>
-      <w:r>
-        <w:t>As a result, every function downstream of a memory has to know that memory's placeholder convention: the offset of the first real entry, whether capacity checks count the placeholder, and which reset method was used.</w:t>
-      </w:r>
-    </w:p>
-    <w:p>
-      <w:pPr>
-        <w:pStyle w:val="ListBullet"/>
-      </w:pPr>
-      <w:r>
-        <w:t>Proposal: allow empty memories (an empty initializer with a declared entry shape), or a designated placeholder that's dropped on the first write. Also expose the number of stored entries, or a mask of filled slots, so padding and masking downstream don't depend on these conventions.</w:t>
-      </w:r>
-    </w:p>
-    <w:p>
-      <w:pPr>
-        <w:pStyle w:val="Heading1"/>
-      </w:pPr>
-      <w:r>
-        <w:t>Missing functionality</w:t>
-      </w:r>
-    </w:p>
-    <w:p>
-      <w:r>
-        <w:t>Ordered by significance relative to implementation difficulty.</w:t>
+        <w:t xml:space="preserve"> (steps 3 and 4).</w:t>
       </w:r>
     </w:p>
     <w:p>

</xml_diff>